<commit_message>
feat: fix report and add simulink file to lab1
</commit_message>
<xml_diff>
--- a/09-semester/Радиоавтоматика. Системы автоматического управления/лаба/Лаба 1.docx
+++ b/09-semester/Радиоавтоматика. Системы автоматического управления/лаба/Лаба 1.docx
@@ -30,9 +30,10 @@
                 <w:noProof/>
                 <w:sz w:val="28"/>
                 <w:szCs w:val="24"/>
+                <w:lang w:eastAsia="ru-RU"/>
               </w:rPr>
               <w:drawing>
-                <wp:anchor distT="0" distB="0" distL="114300" distR="114300" simplePos="0" relativeHeight="251659264" behindDoc="0" locked="1" layoutInCell="1" allowOverlap="1" wp14:anchorId="13498659" wp14:editId="06B3C1ED">
+                <wp:anchor distT="0" distB="0" distL="0" distR="0" simplePos="0" relativeHeight="2" behindDoc="0" locked="1" layoutInCell="1" allowOverlap="1" wp14:anchorId="30F5784C" wp14:editId="5414D6A5">
                   <wp:simplePos x="0" y="0"/>
                   <wp:positionH relativeFrom="column">
                     <wp:posOffset>45720</wp:posOffset>
@@ -43,33 +44,23 @@
                   <wp:extent cx="733425" cy="828675"/>
                   <wp:effectExtent l="0" t="0" r="9525" b="9525"/>
                   <wp:wrapNone/>
-                  <wp:docPr id="45" name="Рисунок 45" descr="Gerb-BMSTU_01"/>
+                  <wp:docPr id="1026" name="Рисунок 45" descr="Gerb-BMSTU_01"/>
                   <wp:cNvGraphicFramePr>
-                    <a:graphicFrameLocks xmlns:a="http://schemas.openxmlformats.org/drawingml/2006/main" noChangeAspect="1"/>
+                    <a:graphicFrameLocks xmlns:a="http://schemas.openxmlformats.org/drawingml/2006/main"/>
                   </wp:cNvGraphicFramePr>
                   <a:graphic xmlns:a="http://schemas.openxmlformats.org/drawingml/2006/main">
                     <a:graphicData uri="http://schemas.openxmlformats.org/drawingml/2006/picture">
                       <pic:pic xmlns:pic="http://schemas.openxmlformats.org/drawingml/2006/picture">
                         <pic:nvPicPr>
-                          <pic:cNvPr id="0" name="Рисунок 172" descr="Gerb-BMSTU_01"/>
-                          <pic:cNvPicPr>
-                            <a:picLocks noChangeAspect="1" noChangeArrowheads="1"/>
-                          </pic:cNvPicPr>
+                          <pic:cNvPr id="0" name="Рисунок 45"/>
+                          <pic:cNvPicPr/>
                         </pic:nvPicPr>
                         <pic:blipFill>
-                          <a:blip r:embed="rId8">
-                            <a:extLst>
-                              <a:ext uri="{28A0092B-C50C-407E-A947-70E740481C1C}">
-                                <a14:useLocalDpi xmlns:a14="http://schemas.microsoft.com/office/drawing/2010/main" val="0"/>
-                              </a:ext>
-                            </a:extLst>
-                          </a:blip>
+                          <a:blip r:embed="rId8" cstate="print"/>
                           <a:srcRect/>
-                          <a:stretch>
-                            <a:fillRect/>
-                          </a:stretch>
+                          <a:stretch/>
                         </pic:blipFill>
-                        <pic:spPr bwMode="auto">
+                        <pic:spPr>
                           <a:xfrm>
                             <a:off x="0" y="0"/>
                             <a:ext cx="733425" cy="828675"/>
@@ -77,7 +68,6 @@
                           <a:prstGeom prst="rect">
                             <a:avLst/>
                           </a:prstGeom>
-                          <a:noFill/>
                         </pic:spPr>
                       </pic:pic>
                     </a:graphicData>
@@ -493,14 +483,7 @@
           <w:sz w:val="28"/>
           <w:szCs w:val="24"/>
         </w:rPr>
-        <w:t xml:space="preserve">Студент: </w:t>
-      </w:r>
-      <w:r>
-        <w:rPr>
-          <w:sz w:val="28"/>
-          <w:szCs w:val="24"/>
-        </w:rPr>
-        <w:t>Субботин Дмитрий Сергеевич</w:t>
+        <w:t>Студент: Субботин Дмитрий Сергеевич</w:t>
       </w:r>
     </w:p>
     <w:p>
@@ -654,14 +637,6 @@
       <w:pPr>
         <w:pStyle w:val="a3"/>
         <w:rPr>
-          <w:rFonts w:cs="Times New Roman"/>
-        </w:rPr>
-      </w:pPr>
-    </w:p>
-    <w:p>
-      <w:pPr>
-        <w:pStyle w:val="a3"/>
-        <w:rPr>
           <w:b/>
           <w:bCs/>
         </w:rPr>
@@ -671,14 +646,7 @@
           <w:b/>
           <w:bCs/>
         </w:rPr>
-        <w:t>Задание:</w:t>
-      </w:r>
-      <w:r>
-        <w:rPr>
-          <w:b/>
-          <w:bCs/>
-        </w:rPr>
-        <w:t xml:space="preserve"> </w:t>
+        <w:t xml:space="preserve">Задание: </w:t>
       </w:r>
     </w:p>
     <w:p>
@@ -719,24 +687,33 @@
     <w:p>
       <w:pPr>
         <w:pStyle w:val="a3"/>
-        <w:ind w:left="1429" w:firstLine="0"/>
-      </w:pPr>
-    </w:p>
-    <w:p>
-      <w:pPr>
-        <w:pStyle w:val="a3"/>
-      </w:pPr>
-      <w:r>
-        <w:t>Модель в пространстве</w:t>
-      </w:r>
-      <w:r>
-        <w:t xml:space="preserve"> со</w:t>
-      </w:r>
-      <w:r>
-        <w:t>сто</w:t>
-      </w:r>
-      <w:r>
-        <w:t>яний</w:t>
+        <w:numPr>
+          <w:ilvl w:val="0"/>
+          <w:numId w:val="1"/>
+        </w:numPr>
+      </w:pPr>
+      <w:r>
+        <w:t>С помощью выбора масштабирующего коэффициента обеспечить в системе установившуюся ошибку.</w:t>
+      </w:r>
+    </w:p>
+    <w:p>
+      <w:pPr>
+        <w:pStyle w:val="a3"/>
+        <w:numPr>
+          <w:ilvl w:val="0"/>
+          <w:numId w:val="1"/>
+        </w:numPr>
+      </w:pPr>
+      <w:r>
+        <w:t>Собрать в Simulink MatLab структурную схему системы с модальным регулятором и проверить полученные результаты.</w:t>
+      </w:r>
+    </w:p>
+    <w:p>
+      <w:pPr>
+        <w:pStyle w:val="a3"/>
+      </w:pPr>
+      <w:r>
+        <w:t>Модель в пространстве состояний</w:t>
       </w:r>
       <w:r>
         <w:rPr>
@@ -1154,21 +1131,8 @@
       <w:pPr>
         <w:pStyle w:val="a3"/>
       </w:pPr>
-    </w:p>
-    <w:p>
-      <w:pPr>
-        <w:pStyle w:val="a3"/>
-      </w:pPr>
-      <w:r>
-        <w:t xml:space="preserve">Определение этих начальных значений в </w:t>
-      </w:r>
-      <w:proofErr w:type="spellStart"/>
-      <w:r>
-        <w:t>матлаб</w:t>
-      </w:r>
-      <w:proofErr w:type="spellEnd"/>
-      <w:r>
-        <w:t>:</w:t>
+      <w:r>
+        <w:t>Определение этих начальных значений в матлаб:</w:t>
       </w:r>
     </w:p>
     <w:p>
@@ -1180,27 +1144,27 @@
       <w:r>
         <w:rPr>
           <w:noProof/>
+          <w:lang w:eastAsia="ru-RU"/>
         </w:rPr>
         <w:drawing>
-          <wp:inline distT="0" distB="0" distL="0" distR="0" wp14:anchorId="551D01D6" wp14:editId="54DC5EC2">
+          <wp:inline distT="0" distB="0" distL="0" distR="0" wp14:anchorId="3E7B6C61" wp14:editId="1FF9A96B">
             <wp:extent cx="5447619" cy="1028571"/>
             <wp:effectExtent l="0" t="0" r="1270" b="635"/>
-            <wp:docPr id="4" name="Рисунок 4"/>
+            <wp:docPr id="1027" name="Рисунок 4"/>
             <wp:cNvGraphicFramePr>
-              <a:graphicFrameLocks xmlns:a="http://schemas.openxmlformats.org/drawingml/2006/main" noChangeAspect="1"/>
+              <a:graphicFrameLocks xmlns:a="http://schemas.openxmlformats.org/drawingml/2006/main"/>
             </wp:cNvGraphicFramePr>
             <a:graphic xmlns:a="http://schemas.openxmlformats.org/drawingml/2006/main">
               <a:graphicData uri="http://schemas.openxmlformats.org/drawingml/2006/picture">
                 <pic:pic xmlns:pic="http://schemas.openxmlformats.org/drawingml/2006/picture">
                   <pic:nvPicPr>
-                    <pic:cNvPr id="1" name=""/>
+                    <pic:cNvPr id="1" name="Рисунок 4"/>
                     <pic:cNvPicPr/>
                   </pic:nvPicPr>
                   <pic:blipFill>
-                    <a:blip r:embed="rId9"/>
-                    <a:stretch>
-                      <a:fillRect/>
-                    </a:stretch>
+                    <a:blip r:embed="rId9" cstate="print"/>
+                    <a:srcRect/>
+                    <a:stretch/>
                   </pic:blipFill>
                   <pic:spPr>
                     <a:xfrm>
@@ -1272,24 +1236,33 @@
         <w:pStyle w:val="a3"/>
       </w:pPr>
       <w:r>
-        <w:t>Критерий управляемости</w:t>
+        <w:t>Критерий управляемости: для SISO-системы с одним входом и одним выходом вводится понятие матрицы управляемости (размером n × n):</w:t>
+      </w:r>
+    </w:p>
+    <w:p>
+      <w:pPr>
+        <w:pStyle w:val="a3"/>
+      </w:pPr>
+      <w:r>
+        <w:t>[B; AB; A²B; ... Aⁿ⁻¹B].</w:t>
+      </w:r>
+      <w:r>
+        <w:t xml:space="preserve"> Для моего случая</w:t>
       </w:r>
       <w:r>
         <w:t xml:space="preserve">: </w:t>
       </w:r>
       <w:r>
-        <w:t>д</w:t>
-      </w:r>
-      <w:r>
-        <w:t>ля SISO-системы с одним входом и одним выходом вводится понятие матрицы управляемости (размером n × n):</w:t>
-      </w:r>
-    </w:p>
-    <w:p>
-      <w:pPr>
-        <w:pStyle w:val="a3"/>
-      </w:pPr>
-      <w:r>
-        <w:t>[B; AB; A²B; ... Aⁿ⁻¹B].</w:t>
+        <w:rPr>
+          <w:lang w:val="en-US"/>
+        </w:rPr>
+        <w:t>W</w:t>
+      </w:r>
+      <w:r>
+        <w:t xml:space="preserve"> = </w:t>
+      </w:r>
+      <w:r>
+        <w:t>[B; AB; A²B].</w:t>
       </w:r>
     </w:p>
     <w:p>
@@ -1320,27 +1293,27 @@
       <w:r>
         <w:rPr>
           <w:noProof/>
+          <w:lang w:eastAsia="ru-RU"/>
         </w:rPr>
         <w:drawing>
-          <wp:inline distT="0" distB="0" distL="0" distR="0" wp14:anchorId="70F09D1F" wp14:editId="59C8AB8A">
+          <wp:inline distT="0" distB="0" distL="0" distR="0" wp14:anchorId="47E54217" wp14:editId="41254C7D">
             <wp:extent cx="5447619" cy="1647619"/>
             <wp:effectExtent l="0" t="0" r="1270" b="0"/>
-            <wp:docPr id="13" name="Рисунок 13"/>
+            <wp:docPr id="1028" name="Рисунок 13"/>
             <wp:cNvGraphicFramePr>
-              <a:graphicFrameLocks xmlns:a="http://schemas.openxmlformats.org/drawingml/2006/main" noChangeAspect="1"/>
+              <a:graphicFrameLocks xmlns:a="http://schemas.openxmlformats.org/drawingml/2006/main"/>
             </wp:cNvGraphicFramePr>
             <a:graphic xmlns:a="http://schemas.openxmlformats.org/drawingml/2006/main">
               <a:graphicData uri="http://schemas.openxmlformats.org/drawingml/2006/picture">
                 <pic:pic xmlns:pic="http://schemas.openxmlformats.org/drawingml/2006/picture">
                   <pic:nvPicPr>
-                    <pic:cNvPr id="1" name=""/>
+                    <pic:cNvPr id="2" name="Рисунок 13"/>
                     <pic:cNvPicPr/>
                   </pic:nvPicPr>
                   <pic:blipFill>
-                    <a:blip r:embed="rId10"/>
-                    <a:stretch>
-                      <a:fillRect/>
-                    </a:stretch>
+                    <a:blip r:embed="rId10" cstate="print"/>
+                    <a:srcRect/>
+                    <a:stretch/>
                   </pic:blipFill>
                   <pic:spPr>
                     <a:xfrm>
@@ -1368,10 +1341,7 @@
         </w:rPr>
       </w:pPr>
       <w:r>
-        <w:t xml:space="preserve">Рисунок 2 – </w:t>
-      </w:r>
-      <w:r>
-        <w:t>Проверка управляемости</w:t>
+        <w:t>Рисунок 2 – Проверка управляемости</w:t>
       </w:r>
     </w:p>
     <w:p>
@@ -1383,46 +1353,36 @@
           <w:rStyle w:val="a4"/>
         </w:rPr>
       </w:pPr>
-    </w:p>
-    <w:p>
-      <w:pPr>
-        <w:pStyle w:val="a3"/>
-        <w:ind w:firstLine="0"/>
-        <w:jc w:val="center"/>
-        <w:rPr>
-          <w:rStyle w:val="a4"/>
-        </w:rPr>
-      </w:pPr>
       <w:r>
         <w:rPr>
           <w:noProof/>
+          <w:lang w:eastAsia="ru-RU"/>
         </w:rPr>
         <w:lastRenderedPageBreak/>
         <w:drawing>
-          <wp:inline distT="0" distB="0" distL="0" distR="0" wp14:anchorId="1B9BA978" wp14:editId="31ADADD1">
+          <wp:inline distT="0" distB="0" distL="0" distR="0" wp14:anchorId="4EF432F9" wp14:editId="095452F3">
             <wp:extent cx="2838450" cy="1674908"/>
             <wp:effectExtent l="0" t="0" r="0" b="1905"/>
-            <wp:docPr id="12" name="Рисунок 12"/>
+            <wp:docPr id="1029" name="Рисунок 12"/>
             <wp:cNvGraphicFramePr>
-              <a:graphicFrameLocks xmlns:a="http://schemas.openxmlformats.org/drawingml/2006/main" noChangeAspect="1"/>
+              <a:graphicFrameLocks xmlns:a="http://schemas.openxmlformats.org/drawingml/2006/main"/>
             </wp:cNvGraphicFramePr>
             <a:graphic xmlns:a="http://schemas.openxmlformats.org/drawingml/2006/main">
               <a:graphicData uri="http://schemas.openxmlformats.org/drawingml/2006/picture">
                 <pic:pic xmlns:pic="http://schemas.openxmlformats.org/drawingml/2006/picture">
                   <pic:nvPicPr>
-                    <pic:cNvPr id="1" name=""/>
+                    <pic:cNvPr id="3" name="Рисунок 12"/>
                     <pic:cNvPicPr/>
                   </pic:nvPicPr>
                   <pic:blipFill>
-                    <a:blip r:embed="rId11"/>
-                    <a:stretch>
-                      <a:fillRect/>
-                    </a:stretch>
+                    <a:blip r:embed="rId11" cstate="print"/>
+                    <a:srcRect/>
+                    <a:stretch/>
                   </pic:blipFill>
                   <pic:spPr>
                     <a:xfrm>
                       <a:off x="0" y="0"/>
-                      <a:ext cx="2845313" cy="1678958"/>
+                      <a:ext cx="2838450" cy="1674908"/>
                     </a:xfrm>
                     <a:prstGeom prst="rect">
                       <a:avLst/>
@@ -1442,13 +1402,7 @@
         <w:jc w:val="center"/>
       </w:pPr>
       <w:r>
-        <w:t xml:space="preserve">Рисунок </w:t>
-      </w:r>
-      <w:r>
-        <w:t>3</w:t>
-      </w:r>
-      <w:r>
-        <w:t xml:space="preserve"> – Окно вывода после проверки управляемости</w:t>
+        <w:t>Рисунок 3 – Окно вывода после проверки управляемости</w:t>
       </w:r>
     </w:p>
     <w:p>
@@ -1486,7 +1440,395 @@
         <w:pStyle w:val="a3"/>
       </w:pPr>
       <w:r>
-        <w:t xml:space="preserve">Вариант А). Перерегулирование </w:t>
+        <w:t>Вариант А). Перерегулирование δ равно 0%.</w:t>
+      </w:r>
+      <w:r>
+        <w:t xml:space="preserve"> </w:t>
+      </w:r>
+      <w:r>
+        <w:t xml:space="preserve">По формуле верхняя граница δ: </w:t>
+      </w:r>
+      <m:oMath>
+        <m:sSup>
+          <m:sSupPr>
+            <m:ctrlPr>
+              <w:rPr>
+                <w:rFonts w:ascii="Cambria Math" w:hAnsi="Cambria Math"/>
+              </w:rPr>
+            </m:ctrlPr>
+          </m:sSupPr>
+          <m:e>
+            <m:r>
+              <w:rPr>
+                <w:rFonts w:ascii="Cambria Math" w:hAnsi="Cambria Math"/>
+              </w:rPr>
+              <m:t>e</m:t>
+            </m:r>
+          </m:e>
+          <m:sup>
+            <m:r>
+              <m:rPr>
+                <m:sty m:val="p"/>
+              </m:rPr>
+              <w:rPr>
+                <w:rFonts w:ascii="Cambria Math" w:hAnsi="Cambria Math"/>
+              </w:rPr>
+              <m:t>-</m:t>
+            </m:r>
+            <m:f>
+              <m:fPr>
+                <m:ctrlPr>
+                  <w:rPr>
+                    <w:rFonts w:ascii="Cambria Math" w:hAnsi="Cambria Math"/>
+                  </w:rPr>
+                </m:ctrlPr>
+              </m:fPr>
+              <m:num>
+                <m:r>
+                  <w:rPr>
+                    <w:rFonts w:ascii="Cambria Math" w:hAnsi="Cambria Math"/>
+                  </w:rPr>
+                  <m:t>π</m:t>
+                </m:r>
+              </m:num>
+              <m:den>
+                <m:r>
+                  <w:rPr>
+                    <w:rFonts w:ascii="Cambria Math" w:hAnsi="Cambria Math"/>
+                  </w:rPr>
+                  <m:t>μ</m:t>
+                </m:r>
+              </m:den>
+            </m:f>
+          </m:sup>
+        </m:sSup>
+        <m:r>
+          <m:rPr>
+            <m:sty m:val="p"/>
+          </m:rPr>
+          <w:rPr>
+            <w:rFonts w:ascii="Cambria Math" w:hAnsi="Cambria Math"/>
+          </w:rPr>
+          <m:t>⋅100%</m:t>
+        </m:r>
+      </m:oMath>
+      <w:r>
+        <w:t>. Тогда</w:t>
+      </w:r>
+      <m:oMath>
+        <m:r>
+          <m:rPr>
+            <m:sty m:val="p"/>
+          </m:rPr>
+          <w:rPr>
+            <w:rFonts w:ascii="Cambria Math" w:hAnsi="Cambria Math"/>
+          </w:rPr>
+          <m:t xml:space="preserve"> </m:t>
+        </m:r>
+        <m:sSup>
+          <m:sSupPr>
+            <m:ctrlPr>
+              <w:rPr>
+                <w:rFonts w:ascii="Cambria Math" w:hAnsi="Cambria Math"/>
+              </w:rPr>
+            </m:ctrlPr>
+          </m:sSupPr>
+          <m:e>
+            <m:r>
+              <w:rPr>
+                <w:rFonts w:ascii="Cambria Math" w:hAnsi="Cambria Math"/>
+              </w:rPr>
+              <m:t>e</m:t>
+            </m:r>
+          </m:e>
+          <m:sup>
+            <m:r>
+              <m:rPr>
+                <m:sty m:val="p"/>
+              </m:rPr>
+              <w:rPr>
+                <w:rFonts w:ascii="Cambria Math" w:hAnsi="Cambria Math"/>
+              </w:rPr>
+              <m:t>-</m:t>
+            </m:r>
+            <m:f>
+              <m:fPr>
+                <m:ctrlPr>
+                  <w:rPr>
+                    <w:rFonts w:ascii="Cambria Math" w:hAnsi="Cambria Math"/>
+                  </w:rPr>
+                </m:ctrlPr>
+              </m:fPr>
+              <m:num>
+                <m:r>
+                  <w:rPr>
+                    <w:rFonts w:ascii="Cambria Math" w:hAnsi="Cambria Math"/>
+                  </w:rPr>
+                  <m:t>π</m:t>
+                </m:r>
+              </m:num>
+              <m:den>
+                <m:r>
+                  <w:rPr>
+                    <w:rFonts w:ascii="Cambria Math" w:hAnsi="Cambria Math"/>
+                  </w:rPr>
+                  <m:t>μ</m:t>
+                </m:r>
+              </m:den>
+            </m:f>
+          </m:sup>
+        </m:sSup>
+        <m:r>
+          <m:rPr>
+            <m:sty m:val="p"/>
+          </m:rPr>
+          <w:rPr>
+            <w:rFonts w:ascii="Cambria Math" w:hAnsi="Cambria Math"/>
+          </w:rPr>
+          <m:t xml:space="preserve">=0 ⇒ </m:t>
+        </m:r>
+        <m:f>
+          <m:fPr>
+            <m:ctrlPr>
+              <w:rPr>
+                <w:rFonts w:ascii="Cambria Math" w:hAnsi="Cambria Math"/>
+              </w:rPr>
+            </m:ctrlPr>
+          </m:fPr>
+          <m:num>
+            <m:r>
+              <w:rPr>
+                <w:rFonts w:ascii="Cambria Math" w:hAnsi="Cambria Math"/>
+              </w:rPr>
+              <m:t>π</m:t>
+            </m:r>
+          </m:num>
+          <m:den>
+            <m:r>
+              <w:rPr>
+                <w:rFonts w:ascii="Cambria Math" w:hAnsi="Cambria Math"/>
+              </w:rPr>
+              <m:t>μ</m:t>
+            </m:r>
+          </m:den>
+        </m:f>
+        <m:r>
+          <m:rPr>
+            <m:sty m:val="p"/>
+          </m:rPr>
+          <w:rPr>
+            <w:rFonts w:ascii="Cambria Math" w:hAnsi="Cambria Math"/>
+          </w:rPr>
+          <m:t xml:space="preserve"> →+∞ ⇒</m:t>
+        </m:r>
+        <m:r>
+          <w:rPr>
+            <w:rFonts w:ascii="Cambria Math" w:hAnsi="Cambria Math"/>
+          </w:rPr>
+          <m:t>μ</m:t>
+        </m:r>
+        <m:r>
+          <m:rPr>
+            <m:sty m:val="p"/>
+          </m:rPr>
+          <w:rPr>
+            <w:rFonts w:ascii="Cambria Math" w:hAnsi="Cambria Math"/>
+          </w:rPr>
+          <m:t>=0</m:t>
+        </m:r>
+      </m:oMath>
+      <w:r>
+        <w:t>.</w:t>
+      </w:r>
+      <w:r>
+        <w:t xml:space="preserve"> По формуле</w:t>
+      </w:r>
+      <w:r>
+        <w:t xml:space="preserve">  </w:t>
+      </w:r>
+      <m:oMath>
+        <m:r>
+          <w:rPr>
+            <w:rFonts w:ascii="Cambria Math" w:hAnsi="Cambria Math"/>
+          </w:rPr>
+          <m:t>μ</m:t>
+        </m:r>
+        <m:r>
+          <m:rPr>
+            <m:sty m:val="p"/>
+          </m:rPr>
+          <w:rPr>
+            <w:rFonts w:ascii="Cambria Math" w:hAnsi="Cambria Math"/>
+          </w:rPr>
+          <m:t>=</m:t>
+        </m:r>
+        <m:f>
+          <m:fPr>
+            <m:ctrlPr>
+              <w:rPr>
+                <w:rFonts w:ascii="Cambria Math" w:hAnsi="Cambria Math"/>
+              </w:rPr>
+            </m:ctrlPr>
+          </m:fPr>
+          <m:num>
+            <m:r>
+              <w:rPr>
+                <w:rFonts w:ascii="Cambria Math" w:hAnsi="Cambria Math"/>
+              </w:rPr>
+              <m:t>β</m:t>
+            </m:r>
+          </m:num>
+          <m:den>
+            <m:r>
+              <w:rPr>
+                <w:rFonts w:ascii="Cambria Math" w:hAnsi="Cambria Math"/>
+              </w:rPr>
+              <m:t>α</m:t>
+            </m:r>
+          </m:den>
+        </m:f>
+        <m:r>
+          <m:rPr>
+            <m:sty m:val="p"/>
+          </m:rPr>
+          <w:rPr>
+            <w:rFonts w:ascii="Cambria Math" w:hAnsi="Cambria Math"/>
+          </w:rPr>
+          <m:t>=0⇒</m:t>
+        </m:r>
+      </m:oMath>
+      <w:r>
+        <w:t xml:space="preserve"> так как корни: </w:t>
+      </w:r>
+      <m:oMath>
+        <m:r>
+          <w:rPr>
+            <w:rFonts w:ascii="Cambria Math" w:hAnsi="Cambria Math"/>
+          </w:rPr>
+          <m:t>p</m:t>
+        </m:r>
+        <m:r>
+          <m:rPr>
+            <m:sty m:val="p"/>
+          </m:rPr>
+          <w:rPr>
+            <w:rFonts w:ascii="Cambria Math" w:hAnsi="Cambria Math"/>
+          </w:rPr>
+          <m:t>=-</m:t>
+        </m:r>
+        <m:r>
+          <w:rPr>
+            <w:rFonts w:ascii="Cambria Math" w:hAnsi="Cambria Math"/>
+          </w:rPr>
+          <m:t>α</m:t>
+        </m:r>
+        <m:r>
+          <m:rPr>
+            <m:sty m:val="p"/>
+          </m:rPr>
+          <w:rPr>
+            <w:rFonts w:ascii="Cambria Math" w:hAnsi="Cambria Math"/>
+          </w:rPr>
+          <m:t>∓</m:t>
+        </m:r>
+        <m:r>
+          <w:rPr>
+            <w:rFonts w:ascii="Cambria Math" w:hAnsi="Cambria Math"/>
+          </w:rPr>
+          <m:t>j</m:t>
+        </m:r>
+        <m:r>
+          <m:rPr>
+            <m:sty m:val="p"/>
+          </m:rPr>
+          <w:rPr>
+            <w:rFonts w:ascii="Cambria Math" w:hAnsi="Cambria Math"/>
+          </w:rPr>
+          <m:t>∙</m:t>
+        </m:r>
+        <m:r>
+          <w:rPr>
+            <w:rFonts w:ascii="Cambria Math" w:hAnsi="Cambria Math"/>
+          </w:rPr>
+          <m:t>β</m:t>
+        </m:r>
+      </m:oMath>
+      <w:r>
+        <w:t>, то для апериодического процесса комплексной части корней нет. Итак, пусть желаемые полюса: P = [-1; -2; -3].</w:t>
+      </w:r>
+    </w:p>
+    <w:p>
+      <w:pPr>
+        <w:pStyle w:val="a3"/>
+      </w:pPr>
+    </w:p>
+    <w:p>
+      <w:pPr>
+        <w:pStyle w:val="a3"/>
+        <w:ind w:firstLine="0"/>
+        <w:jc w:val="center"/>
+        <w:rPr>
+          <w:rFonts w:eastAsia="SimSun"/>
+        </w:rPr>
+      </w:pPr>
+      <w:r>
+        <w:rPr>
+          <w:noProof/>
+          <w:lang w:eastAsia="ru-RU"/>
+        </w:rPr>
+        <w:drawing>
+          <wp:inline distT="0" distB="0" distL="0" distR="0" wp14:anchorId="02FEFB9D" wp14:editId="0B076684">
+            <wp:extent cx="5447619" cy="1038095"/>
+            <wp:effectExtent l="0" t="0" r="1270" b="0"/>
+            <wp:docPr id="1030" name="Рисунок 14"/>
+            <wp:cNvGraphicFramePr>
+              <a:graphicFrameLocks xmlns:a="http://schemas.openxmlformats.org/drawingml/2006/main"/>
+            </wp:cNvGraphicFramePr>
+            <a:graphic xmlns:a="http://schemas.openxmlformats.org/drawingml/2006/main">
+              <a:graphicData uri="http://schemas.openxmlformats.org/drawingml/2006/picture">
+                <pic:pic xmlns:pic="http://schemas.openxmlformats.org/drawingml/2006/picture">
+                  <pic:nvPicPr>
+                    <pic:cNvPr id="4" name="Рисунок 14"/>
+                    <pic:cNvPicPr/>
+                  </pic:nvPicPr>
+                  <pic:blipFill>
+                    <a:blip r:embed="rId12" cstate="print"/>
+                    <a:srcRect/>
+                    <a:stretch/>
+                  </pic:blipFill>
+                  <pic:spPr>
+                    <a:xfrm>
+                      <a:off x="0" y="0"/>
+                      <a:ext cx="5447619" cy="1038095"/>
+                    </a:xfrm>
+                    <a:prstGeom prst="rect">
+                      <a:avLst/>
+                    </a:prstGeom>
+                  </pic:spPr>
+                </pic:pic>
+              </a:graphicData>
+            </a:graphic>
+          </wp:inline>
+        </w:drawing>
+      </w:r>
+    </w:p>
+    <w:p>
+      <w:pPr>
+        <w:pStyle w:val="a3"/>
+        <w:ind w:firstLine="0"/>
+        <w:jc w:val="center"/>
+      </w:pPr>
+      <w:r>
+        <w:t xml:space="preserve">Рисунок 4 – </w:t>
+      </w:r>
+      <w:r>
+        <w:t xml:space="preserve">Расчет коэффициентов ОС для случая </w:t>
+      </w:r>
+      <w:r>
+        <w:t>δ</w:t>
+      </w:r>
+      <w:r>
+        <w:t xml:space="preserve"> </w:t>
       </w:r>
       <w:r>
         <w:t>равно 0%.</w:t>
@@ -1495,21 +1837,89 @@
     <w:p>
       <w:pPr>
         <w:pStyle w:val="a3"/>
-      </w:pPr>
-      <w:r>
-        <w:t>По формуле</w:t>
-      </w:r>
-      <w:r>
-        <w:t xml:space="preserve"> верхняя граница</w:t>
-      </w:r>
-      <w:r>
-        <w:t xml:space="preserve"> перерегулировани</w:t>
-      </w:r>
-      <w:r>
-        <w:t>я</w:t>
-      </w:r>
-      <w:r>
-        <w:t>:</w:t>
+        <w:ind w:firstLine="0"/>
+        <w:rPr>
+          <w:rFonts w:eastAsia="SimSun"/>
+        </w:rPr>
+      </w:pPr>
+    </w:p>
+    <w:p>
+      <w:pPr>
+        <w:pStyle w:val="a3"/>
+        <w:ind w:firstLine="0"/>
+        <w:jc w:val="center"/>
+      </w:pPr>
+      <w:r>
+        <w:rPr>
+          <w:noProof/>
+          <w:lang w:eastAsia="ru-RU"/>
+        </w:rPr>
+        <w:drawing>
+          <wp:inline distT="0" distB="0" distL="0" distR="0" wp14:anchorId="35F49D70" wp14:editId="0448A71A">
+            <wp:extent cx="3990975" cy="830070"/>
+            <wp:effectExtent l="0" t="0" r="0" b="8255"/>
+            <wp:docPr id="1031" name="Рисунок 20"/>
+            <wp:cNvGraphicFramePr>
+              <a:graphicFrameLocks xmlns:a="http://schemas.openxmlformats.org/drawingml/2006/main"/>
+            </wp:cNvGraphicFramePr>
+            <a:graphic xmlns:a="http://schemas.openxmlformats.org/drawingml/2006/main">
+              <a:graphicData uri="http://schemas.openxmlformats.org/drawingml/2006/picture">
+                <pic:pic xmlns:pic="http://schemas.openxmlformats.org/drawingml/2006/picture">
+                  <pic:nvPicPr>
+                    <pic:cNvPr id="5" name="Рисунок 20"/>
+                    <pic:cNvPicPr/>
+                  </pic:nvPicPr>
+                  <pic:blipFill>
+                    <a:blip r:embed="rId13" cstate="print"/>
+                    <a:srcRect/>
+                    <a:stretch/>
+                  </pic:blipFill>
+                  <pic:spPr>
+                    <a:xfrm>
+                      <a:off x="0" y="0"/>
+                      <a:ext cx="3990975" cy="830070"/>
+                    </a:xfrm>
+                    <a:prstGeom prst="rect">
+                      <a:avLst/>
+                    </a:prstGeom>
+                  </pic:spPr>
+                </pic:pic>
+              </a:graphicData>
+            </a:graphic>
+          </wp:inline>
+        </w:drawing>
+      </w:r>
+    </w:p>
+    <w:p>
+      <w:pPr>
+        <w:pStyle w:val="a3"/>
+        <w:ind w:firstLine="0"/>
+        <w:jc w:val="center"/>
+      </w:pPr>
+      <w:r>
+        <w:t xml:space="preserve">Рисунок 5 – Окно вывода для случая </w:t>
+      </w:r>
+      <w:r>
+        <w:t>δ</w:t>
+      </w:r>
+      <w:r>
+        <w:t xml:space="preserve"> </w:t>
+      </w:r>
+      <w:r>
+        <w:t>равно 0%.</w:t>
+      </w:r>
+    </w:p>
+    <w:p>
+      <w:pPr>
+        <w:pStyle w:val="a3"/>
+      </w:pPr>
+    </w:p>
+    <w:p>
+      <w:pPr>
+        <w:pStyle w:val="a3"/>
+      </w:pPr>
+      <w:r>
+        <w:t>Вариант Б). Перерегулирование равно 30%.</w:t>
       </w:r>
     </w:p>
     <w:p>
@@ -1517,107 +1927,11 @@
         <w:pStyle w:val="a3"/>
         <w:rPr>
           <w:rFonts w:eastAsiaTheme="minorEastAsia"/>
+          <w:i/>
         </w:rPr>
       </w:pPr>
       <m:oMathPara>
         <m:oMath>
-          <m:sSup>
-            <m:sSupPr>
-              <m:ctrlPr>
-                <w:rPr>
-                  <w:rFonts w:ascii="Cambria Math" w:hAnsi="Cambria Math"/>
-                </w:rPr>
-              </m:ctrlPr>
-            </m:sSupPr>
-            <m:e>
-              <m:r>
-                <w:rPr>
-                  <w:rFonts w:ascii="Cambria Math" w:hAnsi="Cambria Math"/>
-                </w:rPr>
-                <m:t>e</m:t>
-              </m:r>
-            </m:e>
-            <m:sup>
-              <m:r>
-                <m:rPr>
-                  <m:sty m:val="p"/>
-                </m:rPr>
-                <w:rPr>
-                  <w:rFonts w:ascii="Cambria Math" w:hAnsi="Cambria Math"/>
-                </w:rPr>
-                <m:t>-</m:t>
-              </m:r>
-              <m:f>
-                <m:fPr>
-                  <m:ctrlPr>
-                    <w:rPr>
-                      <w:rFonts w:ascii="Cambria Math" w:hAnsi="Cambria Math"/>
-                    </w:rPr>
-                  </m:ctrlPr>
-                </m:fPr>
-                <m:num>
-                  <m:r>
-                    <w:rPr>
-                      <w:rFonts w:ascii="Cambria Math" w:hAnsi="Cambria Math"/>
-                    </w:rPr>
-                    <m:t>π</m:t>
-                  </m:r>
-                </m:num>
-                <m:den>
-                  <m:r>
-                    <w:rPr>
-                      <w:rFonts w:ascii="Cambria Math" w:hAnsi="Cambria Math"/>
-                    </w:rPr>
-                    <m:t>μ</m:t>
-                  </m:r>
-                </m:den>
-              </m:f>
-            </m:sup>
-          </m:sSup>
-          <m:r>
-            <m:rPr>
-              <m:sty m:val="p"/>
-            </m:rPr>
-            <w:rPr>
-              <w:rFonts w:ascii="Cambria Math" w:hAnsi="Cambria Math"/>
-            </w:rPr>
-            <m:t>⋅100%</m:t>
-          </m:r>
-        </m:oMath>
-      </m:oMathPara>
-    </w:p>
-    <w:p>
-      <w:pPr>
-        <w:pStyle w:val="a3"/>
-        <w:rPr>
-          <w:rFonts w:eastAsiaTheme="minorEastAsia"/>
-        </w:rPr>
-      </w:pPr>
-      <w:r>
-        <w:rPr>
-          <w:rFonts w:eastAsiaTheme="minorEastAsia"/>
-        </w:rPr>
-        <w:t xml:space="preserve">Значит </w:t>
-      </w:r>
-    </w:p>
-    <w:p>
-      <w:pPr>
-        <w:pStyle w:val="a3"/>
-        <w:rPr>
-          <w:rFonts w:eastAsiaTheme="minorEastAsia"/>
-        </w:rPr>
-      </w:pPr>
-      <m:oMathPara>
-        <m:oMath>
-          <m:r>
-            <m:rPr>
-              <m:sty m:val="p"/>
-            </m:rPr>
-            <w:rPr>
-              <w:rFonts w:ascii="Cambria Math" w:hAnsi="Cambria Math" w:cs="Cambria Math"/>
-            </w:rPr>
-            <m:t xml:space="preserve"> </m:t>
-          </m:r>
           <m:sSup>
             <m:sSupPr>
               <m:ctrlPr>
@@ -1675,7 +1989,7 @@
             <w:rPr>
               <w:rFonts w:ascii="Cambria Math" w:hAnsi="Cambria Math"/>
             </w:rPr>
-            <m:t xml:space="preserve">=0 </m:t>
+            <m:t>=0.3</m:t>
           </m:r>
           <m:r>
             <m:rPr>
@@ -1684,7 +1998,16 @@
             <w:rPr>
               <w:rFonts w:ascii="Cambria Math" w:hAnsi="Cambria Math" w:cs="Cambria Math"/>
             </w:rPr>
-            <m:t xml:space="preserve">⇒ </m:t>
+            <m:t>⇒</m:t>
+          </m:r>
+          <m:r>
+            <m:rPr>
+              <m:sty m:val="p"/>
+            </m:rPr>
+            <w:rPr>
+              <w:rFonts w:ascii="Cambria Math" w:hAnsi="Cambria Math"/>
+            </w:rPr>
+            <m:t>-</m:t>
           </m:r>
           <m:f>
             <m:fPr>
@@ -1715,8 +2038,54 @@
             <w:rPr>
               <w:rFonts w:ascii="Cambria Math" w:hAnsi="Cambria Math"/>
             </w:rPr>
-            <m:t xml:space="preserve"> →+∞ </m:t>
+            <m:t>=</m:t>
           </m:r>
+          <m:func>
+            <m:funcPr>
+              <m:ctrlPr>
+                <w:rPr>
+                  <w:rFonts w:ascii="Cambria Math" w:hAnsi="Cambria Math"/>
+                </w:rPr>
+              </m:ctrlPr>
+            </m:funcPr>
+            <m:fName>
+              <m:r>
+                <m:rPr>
+                  <m:sty m:val="p"/>
+                </m:rPr>
+                <w:rPr>
+                  <w:rFonts w:ascii="Cambria Math" w:hAnsi="Cambria Math"/>
+                </w:rPr>
+                <m:t>ln</m:t>
+              </m:r>
+              <m:ctrlPr>
+                <w:rPr>
+                  <w:rFonts w:ascii="Cambria Math" w:hAnsi="Cambria Math"/>
+                  <w:i/>
+                </w:rPr>
+              </m:ctrlPr>
+            </m:fName>
+            <m:e>
+              <m:d>
+                <m:dPr>
+                  <m:ctrlPr>
+                    <w:rPr>
+                      <w:rFonts w:ascii="Cambria Math" w:hAnsi="Cambria Math"/>
+                      <w:i/>
+                    </w:rPr>
+                  </m:ctrlPr>
+                </m:dPr>
+                <m:e>
+                  <m:r>
+                    <w:rPr>
+                      <w:rFonts w:ascii="Cambria Math" w:hAnsi="Cambria Math"/>
+                    </w:rPr>
+                    <m:t>0.3</m:t>
+                  </m:r>
+                </m:e>
+              </m:d>
+            </m:e>
+          </m:func>
           <m:r>
             <m:rPr>
               <m:sty m:val="p"/>
@@ -1730,7 +2099,110 @@
             <w:rPr>
               <w:rFonts w:ascii="Cambria Math" w:hAnsi="Cambria Math"/>
             </w:rPr>
-            <m:t>μ→0</m:t>
+            <m:t>μ=</m:t>
+          </m:r>
+          <m:f>
+            <m:fPr>
+              <m:ctrlPr>
+                <w:rPr>
+                  <w:rFonts w:ascii="Cambria Math" w:hAnsi="Cambria Math"/>
+                </w:rPr>
+              </m:ctrlPr>
+            </m:fPr>
+            <m:num>
+              <m:r>
+                <w:rPr>
+                  <w:rFonts w:ascii="Cambria Math" w:hAnsi="Cambria Math"/>
+                </w:rPr>
+                <m:t>π</m:t>
+              </m:r>
+            </m:num>
+            <m:den>
+              <m:func>
+                <m:funcPr>
+                  <m:ctrlPr>
+                    <w:rPr>
+                      <w:rFonts w:ascii="Cambria Math" w:hAnsi="Cambria Math"/>
+                    </w:rPr>
+                  </m:ctrlPr>
+                </m:funcPr>
+                <m:fName>
+                  <m:r>
+                    <m:rPr>
+                      <m:sty m:val="p"/>
+                    </m:rPr>
+                    <w:rPr>
+                      <w:rFonts w:ascii="Cambria Math" w:hAnsi="Cambria Math"/>
+                    </w:rPr>
+                    <m:t>-ln</m:t>
+                  </m:r>
+                  <m:ctrlPr>
+                    <w:rPr>
+                      <w:rFonts w:ascii="Cambria Math" w:hAnsi="Cambria Math"/>
+                      <w:i/>
+                    </w:rPr>
+                  </m:ctrlPr>
+                </m:fName>
+                <m:e>
+                  <m:d>
+                    <m:dPr>
+                      <m:ctrlPr>
+                        <w:rPr>
+                          <w:rFonts w:ascii="Cambria Math" w:hAnsi="Cambria Math"/>
+                          <w:i/>
+                        </w:rPr>
+                      </m:ctrlPr>
+                    </m:dPr>
+                    <m:e>
+                      <m:r>
+                        <w:rPr>
+                          <w:rFonts w:ascii="Cambria Math" w:hAnsi="Cambria Math"/>
+                        </w:rPr>
+                        <m:t>0.3</m:t>
+                      </m:r>
+                    </m:e>
+                  </m:d>
+                </m:e>
+              </m:func>
+            </m:den>
+          </m:f>
+          <m:r>
+            <w:rPr>
+              <w:rFonts w:ascii="Cambria Math" w:hAnsi="Cambria Math"/>
+            </w:rPr>
+            <m:t>=2.6094=</m:t>
+          </m:r>
+          <m:f>
+            <m:fPr>
+              <m:ctrlPr>
+                <w:rPr>
+                  <w:rFonts w:ascii="Cambria Math" w:hAnsi="Cambria Math"/>
+                </w:rPr>
+              </m:ctrlPr>
+            </m:fPr>
+            <m:num>
+              <m:r>
+                <w:rPr>
+                  <w:rFonts w:ascii="Cambria Math" w:eastAsiaTheme="minorEastAsia" w:hAnsi="Cambria Math"/>
+                  <w:lang w:val="en-US"/>
+                </w:rPr>
+                <m:t>β</m:t>
+              </m:r>
+            </m:num>
+            <m:den>
+              <m:r>
+                <w:rPr>
+                  <w:rFonts w:ascii="Cambria Math" w:eastAsiaTheme="minorEastAsia" w:hAnsi="Cambria Math"/>
+                </w:rPr>
+                <m:t>α</m:t>
+              </m:r>
+            </m:den>
+          </m:f>
+          <m:r>
+            <w:rPr>
+              <w:rFonts w:ascii="Cambria Math" w:hAnsi="Cambria Math"/>
+            </w:rPr>
+            <m:t>.</m:t>
           </m:r>
         </m:oMath>
       </m:oMathPara>
@@ -1738,15 +2210,56 @@
     <w:p>
       <w:pPr>
         <w:pStyle w:val="a3"/>
-        <w:rPr>
-          <w:rFonts w:eastAsiaTheme="minorEastAsia"/>
-        </w:rPr>
-      </w:pPr>
-      <w:r>
-        <w:rPr>
-          <w:rFonts w:eastAsiaTheme="minorEastAsia"/>
-        </w:rPr>
-        <w:t xml:space="preserve">Получается </w:t>
+      </w:pPr>
+      <w:r>
+        <w:t xml:space="preserve">Возьмем </w:t>
+      </w:r>
+      <m:oMath>
+        <m:r>
+          <w:rPr>
+            <w:rFonts w:ascii="Cambria Math" w:eastAsiaTheme="minorEastAsia" w:hAnsi="Cambria Math"/>
+          </w:rPr>
+          <m:t>α=1</m:t>
+        </m:r>
+      </m:oMath>
+      <w:r>
+        <w:t xml:space="preserve">, тогда </w:t>
+      </w:r>
+      <m:oMath>
+        <m:r>
+          <w:rPr>
+            <w:rFonts w:ascii="Cambria Math" w:eastAsiaTheme="minorEastAsia" w:hAnsi="Cambria Math"/>
+            <w:lang w:val="en-US"/>
+          </w:rPr>
+          <m:t>β</m:t>
+        </m:r>
+        <m:r>
+          <w:rPr>
+            <w:rFonts w:ascii="Cambria Math" w:eastAsiaTheme="minorEastAsia" w:hAnsi="Cambria Math"/>
+          </w:rPr>
+          <m:t>=</m:t>
+        </m:r>
+        <m:r>
+          <w:rPr>
+            <w:rFonts w:ascii="Cambria Math" w:hAnsi="Cambria Math"/>
+          </w:rPr>
+          <m:t>2.6094</m:t>
+        </m:r>
+        <m:r>
+          <w:rPr>
+            <w:rFonts w:ascii="Cambria Math" w:eastAsiaTheme="minorEastAsia" w:hAnsi="Cambria Math"/>
+          </w:rPr>
+          <m:t>α=</m:t>
+        </m:r>
+        <m:r>
+          <w:rPr>
+            <w:rFonts w:ascii="Cambria Math" w:hAnsi="Cambria Math"/>
+          </w:rPr>
+          <m:t>2.6094</m:t>
+        </m:r>
+      </m:oMath>
+      <w:r>
+        <w:t>.</w:t>
       </w:r>
     </w:p>
     <w:p>
@@ -1754,136 +2267,31 @@
         <w:pStyle w:val="a3"/>
         <w:ind w:firstLine="0"/>
         <w:jc w:val="center"/>
-        <w:rPr>
-          <w:rFonts w:eastAsiaTheme="minorEastAsia"/>
-        </w:rPr>
       </w:pPr>
       <w:r>
         <w:rPr>
           <w:noProof/>
+          <w:lang w:eastAsia="ru-RU"/>
         </w:rPr>
         <w:drawing>
-          <wp:inline distT="0" distB="0" distL="0" distR="0" wp14:anchorId="0E361810" wp14:editId="4C45C7FF">
-            <wp:extent cx="5447619" cy="1038095"/>
-            <wp:effectExtent l="0" t="0" r="1270" b="0"/>
-            <wp:docPr id="14" name="Рисунок 14"/>
+          <wp:inline distT="0" distB="0" distL="0" distR="0" wp14:anchorId="723F3755" wp14:editId="7E3A9C21">
+            <wp:extent cx="5438095" cy="1514286"/>
+            <wp:effectExtent l="0" t="0" r="0" b="0"/>
+            <wp:docPr id="1032" name="Рисунок 21"/>
             <wp:cNvGraphicFramePr>
-              <a:graphicFrameLocks xmlns:a="http://schemas.openxmlformats.org/drawingml/2006/main" noChangeAspect="1"/>
+              <a:graphicFrameLocks xmlns:a="http://schemas.openxmlformats.org/drawingml/2006/main"/>
             </wp:cNvGraphicFramePr>
             <a:graphic xmlns:a="http://schemas.openxmlformats.org/drawingml/2006/main">
               <a:graphicData uri="http://schemas.openxmlformats.org/drawingml/2006/picture">
                 <pic:pic xmlns:pic="http://schemas.openxmlformats.org/drawingml/2006/picture">
                   <pic:nvPicPr>
-                    <pic:cNvPr id="1" name=""/>
+                    <pic:cNvPr id="6" name="Рисунок 21"/>
                     <pic:cNvPicPr/>
                   </pic:nvPicPr>
                   <pic:blipFill>
-                    <a:blip r:embed="rId12"/>
-                    <a:stretch>
-                      <a:fillRect/>
-                    </a:stretch>
-                  </pic:blipFill>
-                  <pic:spPr>
-                    <a:xfrm>
-                      <a:off x="0" y="0"/>
-                      <a:ext cx="5447619" cy="1038095"/>
-                    </a:xfrm>
-                    <a:prstGeom prst="rect">
-                      <a:avLst/>
-                    </a:prstGeom>
-                  </pic:spPr>
-                </pic:pic>
-              </a:graphicData>
-            </a:graphic>
-          </wp:inline>
-        </w:drawing>
-      </w:r>
-    </w:p>
-    <w:p>
-      <w:pPr>
-        <w:pStyle w:val="a3"/>
-        <w:ind w:firstLine="0"/>
-        <w:jc w:val="center"/>
-      </w:pPr>
-      <w:r>
-        <w:rPr>
-          <w:noProof/>
-        </w:rPr>
-        <w:drawing>
-          <wp:inline distT="0" distB="0" distL="0" distR="0" wp14:anchorId="2E895F50" wp14:editId="11788B16">
-            <wp:extent cx="3990975" cy="830070"/>
-            <wp:effectExtent l="0" t="0" r="0" b="8255"/>
-            <wp:docPr id="20" name="Рисунок 20"/>
-            <wp:cNvGraphicFramePr>
-              <a:graphicFrameLocks xmlns:a="http://schemas.openxmlformats.org/drawingml/2006/main" noChangeAspect="1"/>
-            </wp:cNvGraphicFramePr>
-            <a:graphic xmlns:a="http://schemas.openxmlformats.org/drawingml/2006/main">
-              <a:graphicData uri="http://schemas.openxmlformats.org/drawingml/2006/picture">
-                <pic:pic xmlns:pic="http://schemas.openxmlformats.org/drawingml/2006/picture">
-                  <pic:nvPicPr>
-                    <pic:cNvPr id="1" name=""/>
-                    <pic:cNvPicPr/>
-                  </pic:nvPicPr>
-                  <pic:blipFill>
-                    <a:blip r:embed="rId13"/>
-                    <a:stretch>
-                      <a:fillRect/>
-                    </a:stretch>
-                  </pic:blipFill>
-                  <pic:spPr>
-                    <a:xfrm>
-                      <a:off x="0" y="0"/>
-                      <a:ext cx="4052676" cy="842903"/>
-                    </a:xfrm>
-                    <a:prstGeom prst="rect">
-                      <a:avLst/>
-                    </a:prstGeom>
-                  </pic:spPr>
-                </pic:pic>
-              </a:graphicData>
-            </a:graphic>
-          </wp:inline>
-        </w:drawing>
-      </w:r>
-    </w:p>
-    <w:p>
-      <w:pPr>
-        <w:pStyle w:val="a3"/>
-      </w:pPr>
-    </w:p>
-    <w:p>
-      <w:pPr>
-        <w:pStyle w:val="a3"/>
-        <w:ind w:firstLine="0"/>
-        <w:jc w:val="center"/>
-        <w:rPr>
-          <w:lang w:val="en-US"/>
-        </w:rPr>
-      </w:pPr>
-      <w:r>
-        <w:rPr>
-          <w:noProof/>
-        </w:rPr>
-        <w:drawing>
-          <wp:inline distT="0" distB="0" distL="0" distR="0" wp14:anchorId="7BA65CC6" wp14:editId="384219EE">
-            <wp:extent cx="5438095" cy="1514286"/>
-            <wp:effectExtent l="0" t="0" r="0" b="0"/>
-            <wp:docPr id="21" name="Рисунок 21"/>
-            <wp:cNvGraphicFramePr>
-              <a:graphicFrameLocks xmlns:a="http://schemas.openxmlformats.org/drawingml/2006/main" noChangeAspect="1"/>
-            </wp:cNvGraphicFramePr>
-            <a:graphic xmlns:a="http://schemas.openxmlformats.org/drawingml/2006/main">
-              <a:graphicData uri="http://schemas.openxmlformats.org/drawingml/2006/picture">
-                <pic:pic xmlns:pic="http://schemas.openxmlformats.org/drawingml/2006/picture">
-                  <pic:nvPicPr>
-                    <pic:cNvPr id="1" name=""/>
-                    <pic:cNvPicPr/>
-                  </pic:nvPicPr>
-                  <pic:blipFill>
-                    <a:blip r:embed="rId14"/>
-                    <a:stretch>
-                      <a:fillRect/>
-                    </a:stretch>
+                    <a:blip r:embed="rId14" cstate="print"/>
+                    <a:srcRect/>
+                    <a:stretch/>
                   </pic:blipFill>
                   <pic:spPr>
                     <a:xfrm>
@@ -1908,34 +2316,60 @@
         <w:jc w:val="center"/>
       </w:pPr>
       <w:r>
+        <w:t xml:space="preserve">Рисунок 6 – Расчет коэффициентов ОС для случая </w:t>
+      </w:r>
+      <w:r>
+        <w:t>δ</w:t>
+      </w:r>
+      <w:r>
+        <w:t xml:space="preserve"> </w:t>
+      </w:r>
+      <w:r>
+        <w:t xml:space="preserve">равно </w:t>
+      </w:r>
+      <w:r>
+        <w:t>30</w:t>
+      </w:r>
+      <w:r>
+        <w:t>%.</w:t>
+      </w:r>
+    </w:p>
+    <w:p>
+      <w:pPr>
+        <w:pStyle w:val="a3"/>
+        <w:ind w:firstLine="0"/>
+        <w:jc w:val="center"/>
+      </w:pPr>
+      <w:r>
         <w:rPr>
           <w:noProof/>
-        </w:rPr>
+          <w:lang w:eastAsia="ru-RU"/>
+        </w:rPr>
+        <w:lastRenderedPageBreak/>
         <w:drawing>
-          <wp:inline distT="0" distB="0" distL="0" distR="0" wp14:anchorId="375B0698" wp14:editId="2B177147">
+          <wp:inline distT="0" distB="0" distL="0" distR="0" wp14:anchorId="29849FB1" wp14:editId="5FEF0CF6">
             <wp:extent cx="3910399" cy="823595"/>
             <wp:effectExtent l="0" t="0" r="0" b="0"/>
-            <wp:docPr id="22" name="Рисунок 22"/>
+            <wp:docPr id="1033" name="Рисунок 22"/>
             <wp:cNvGraphicFramePr>
-              <a:graphicFrameLocks xmlns:a="http://schemas.openxmlformats.org/drawingml/2006/main" noChangeAspect="1"/>
+              <a:graphicFrameLocks xmlns:a="http://schemas.openxmlformats.org/drawingml/2006/main"/>
             </wp:cNvGraphicFramePr>
             <a:graphic xmlns:a="http://schemas.openxmlformats.org/drawingml/2006/main">
               <a:graphicData uri="http://schemas.openxmlformats.org/drawingml/2006/picture">
                 <pic:pic xmlns:pic="http://schemas.openxmlformats.org/drawingml/2006/picture">
                   <pic:nvPicPr>
-                    <pic:cNvPr id="1" name=""/>
+                    <pic:cNvPr id="7" name="Рисунок 22"/>
                     <pic:cNvPicPr/>
                   </pic:nvPicPr>
                   <pic:blipFill>
-                    <a:blip r:embed="rId15"/>
-                    <a:stretch>
-                      <a:fillRect/>
-                    </a:stretch>
+                    <a:blip r:embed="rId15" cstate="print"/>
+                    <a:srcRect/>
+                    <a:stretch/>
                   </pic:blipFill>
                   <pic:spPr>
                     <a:xfrm>
                       <a:off x="0" y="0"/>
-                      <a:ext cx="3942525" cy="830361"/>
+                      <a:ext cx="3910399" cy="823595"/>
                     </a:xfrm>
                     <a:prstGeom prst="rect">
                       <a:avLst/>
@@ -1951,11 +2385,32 @@
     <w:p>
       <w:pPr>
         <w:pStyle w:val="a3"/>
-      </w:pPr>
-    </w:p>
-    <w:p>
-      <w:pPr>
-        <w:pStyle w:val="a3"/>
+        <w:ind w:firstLine="0"/>
+        <w:jc w:val="center"/>
+      </w:pPr>
+      <w:r>
+        <w:t xml:space="preserve">Рисунок 7 – Окно вывода для случая </w:t>
+      </w:r>
+      <w:r>
+        <w:t>δ</w:t>
+      </w:r>
+      <w:r>
+        <w:t xml:space="preserve"> </w:t>
+      </w:r>
+      <w:r>
+        <w:t xml:space="preserve">равно </w:t>
+      </w:r>
+      <w:r>
+        <w:t>30</w:t>
+      </w:r>
+      <w:r>
+        <w:t>%.</w:t>
+      </w:r>
+    </w:p>
+    <w:p>
+      <w:pPr>
+        <w:pStyle w:val="a3"/>
+        <w:ind w:firstLine="0"/>
       </w:pPr>
     </w:p>
     <w:p>
@@ -1980,15 +2435,7 @@
           <w:b/>
           <w:bCs/>
         </w:rPr>
-        <w:lastRenderedPageBreak/>
-        <w:t>Выбор масштабируемого коэффициента</w:t>
-      </w:r>
-      <w:r>
-        <w:rPr>
-          <w:b/>
-          <w:bCs/>
-        </w:rPr>
-        <w:t>.</w:t>
+        <w:t>Выбор масштабируемого коэффициента.</w:t>
       </w:r>
     </w:p>
     <w:p>
@@ -2074,13 +2521,7 @@
             <w:rPr>
               <w:rFonts w:ascii="Cambria Math" w:hAnsi="Cambria Math"/>
             </w:rPr>
-            <m:t> </m:t>
-          </m:r>
-          <m:r>
-            <w:rPr>
-              <w:rFonts w:ascii="Cambria Math" w:hAnsi="Cambria Math"/>
-            </w:rPr>
-            <m:t>g</m:t>
+            <m:t> g</m:t>
           </m:r>
           <m:d>
             <m:dPr>
@@ -2154,7 +2595,7 @@
       <w:pPr>
         <w:pStyle w:val="a3"/>
         <w:rPr>
-          <w:rFonts w:eastAsiaTheme="minorEastAsia"/>
+          <w:rFonts w:eastAsia="SimSun"/>
         </w:rPr>
       </w:pPr>
       <m:oMathPara>
@@ -2205,13 +2646,7 @@
             <w:rPr>
               <w:rFonts w:ascii="Cambria Math" w:hAnsi="Cambria Math"/>
             </w:rPr>
-            <m:t>X+B</m:t>
-          </m:r>
-          <m:r>
-            <w:rPr>
-              <w:rFonts w:ascii="Cambria Math" w:hAnsi="Cambria Math"/>
-            </w:rPr>
-            <m:t> </m:t>
+            <m:t>X+B </m:t>
           </m:r>
           <m:sSub>
             <m:sSubPr>
@@ -2243,13 +2678,7 @@
             <w:rPr>
               <w:rFonts w:ascii="Cambria Math" w:hAnsi="Cambria Math"/>
             </w:rPr>
-            <m:t> </m:t>
-          </m:r>
-          <m:r>
-            <w:rPr>
-              <w:rFonts w:ascii="Cambria Math" w:hAnsi="Cambria Math"/>
-            </w:rPr>
-            <m:t>g</m:t>
+            <m:t> g</m:t>
           </m:r>
         </m:oMath>
       </m:oMathPara>
@@ -2258,7 +2687,7 @@
       <w:pPr>
         <w:pStyle w:val="a3"/>
         <w:rPr>
-          <w:rFonts w:eastAsiaTheme="minorEastAsia"/>
+          <w:rFonts w:eastAsia="SimSun"/>
         </w:rPr>
       </w:pPr>
       <m:oMathPara>
@@ -2275,9 +2704,6 @@
     <w:p>
       <w:pPr>
         <w:pStyle w:val="a3"/>
-        <w:rPr>
-          <w:lang w:val="en-US"/>
-        </w:rPr>
       </w:pPr>
       <w:r>
         <w:t>В установившемся режиме при </w:t>
@@ -2285,26 +2711,20 @@
       <m:oMath>
         <m:r>
           <w:rPr>
-            <w:rFonts w:ascii="Cambria Math" w:eastAsiaTheme="minorEastAsia" w:hAnsi="Cambria Math"/>
+            <w:rFonts w:ascii="Cambria Math" w:eastAsia="SimSun" w:hAnsi="Cambria Math"/>
           </w:rPr>
           <m:t>g</m:t>
         </m:r>
         <m:r>
           <w:rPr>
             <w:rStyle w:val="katex-mathml"/>
-            <w:rFonts w:ascii="Cambria Math" w:eastAsiaTheme="minorEastAsia" w:hAnsi="Cambria Math"/>
+            <w:rFonts w:ascii="Cambria Math" w:eastAsia="SimSun" w:hAnsi="Cambria Math"/>
           </w:rPr>
           <m:t xml:space="preserve"> =const</m:t>
         </m:r>
       </m:oMath>
       <w:r>
-        <w:t xml:space="preserve"> </w:t>
-      </w:r>
-      <w:r>
-        <w:t>имеем</w:t>
-      </w:r>
-      <w:r>
-        <w:t xml:space="preserve"> </w:t>
+        <w:t xml:space="preserve"> имеем </w:t>
       </w:r>
       <m:oMath>
         <m:acc>
@@ -2334,26 +2754,13 @@
       </m:oMath>
       <w:r>
         <w:rPr>
-          <w:rFonts w:eastAsiaTheme="minorEastAsia"/>
-        </w:rPr>
-        <w:t>.</w:t>
-      </w:r>
-      <w:r>
-        <w:rPr>
-          <w:rFonts w:eastAsiaTheme="minorEastAsia"/>
-        </w:rPr>
-        <w:t xml:space="preserve"> </w:t>
-      </w:r>
-      <w:r>
-        <w:rPr>
-          <w:rFonts w:eastAsiaTheme="minorEastAsia"/>
-        </w:rPr>
-        <w:t>Тогда</w:t>
-      </w:r>
-      <w:r>
-        <w:rPr>
-          <w:rFonts w:eastAsiaTheme="minorEastAsia"/>
-          <w:lang w:val="en-US"/>
+          <w:rFonts w:eastAsia="SimSun"/>
+        </w:rPr>
+        <w:t>. Тогда</w:t>
+      </w:r>
+      <w:r>
+        <w:rPr>
+          <w:rFonts w:eastAsia="SimSun"/>
         </w:rPr>
         <w:t>:</w:t>
       </w:r>
@@ -2421,13 +2828,7 @@
             <w:rPr>
               <w:rFonts w:ascii="Cambria Math" w:hAnsi="Cambria Math"/>
             </w:rPr>
-            <m:t>+B</m:t>
-          </m:r>
-          <m:r>
-            <w:rPr>
-              <w:rFonts w:ascii="Cambria Math" w:hAnsi="Cambria Math"/>
-            </w:rPr>
-            <m:t> </m:t>
+            <m:t>+B </m:t>
           </m:r>
           <m:sSub>
             <m:sSubPr>
@@ -2459,13 +2860,7 @@
             <w:rPr>
               <w:rFonts w:ascii="Cambria Math" w:hAnsi="Cambria Math"/>
             </w:rPr>
-            <m:t> </m:t>
-          </m:r>
-          <m:r>
-            <w:rPr>
-              <w:rFonts w:ascii="Cambria Math" w:hAnsi="Cambria Math"/>
-            </w:rPr>
-            <m:t>g</m:t>
+            <m:t> g</m:t>
           </m:r>
           <m:r>
             <m:rPr>
@@ -2558,13 +2953,7 @@
             <w:rPr>
               <w:rFonts w:ascii="Cambria Math" w:hAnsi="Cambria Math"/>
             </w:rPr>
-            <m:t>B</m:t>
-          </m:r>
-          <m:r>
-            <w:rPr>
-              <w:rFonts w:ascii="Cambria Math" w:hAnsi="Cambria Math"/>
-            </w:rPr>
-            <m:t> </m:t>
+            <m:t>B </m:t>
           </m:r>
           <m:sSub>
             <m:sSubPr>
@@ -2596,13 +2985,7 @@
             <w:rPr>
               <w:rFonts w:ascii="Cambria Math" w:hAnsi="Cambria Math"/>
             </w:rPr>
-            <m:t> </m:t>
-          </m:r>
-          <m:r>
-            <w:rPr>
-              <w:rFonts w:ascii="Cambria Math" w:hAnsi="Cambria Math"/>
-            </w:rPr>
-            <m:t>g</m:t>
+            <m:t> g</m:t>
           </m:r>
         </m:oMath>
       </m:oMathPara>
@@ -2617,10 +3000,7 @@
         <w:pStyle w:val="a3"/>
       </w:pPr>
       <w:r>
-        <w:t>Тогда у</w:t>
-      </w:r>
-      <w:r>
-        <w:t>становившееся значение выхода:</w:t>
+        <w:t>Тогда установившееся значение выхода:</w:t>
       </w:r>
     </w:p>
     <w:p>
@@ -2697,19 +3077,7 @@
             <w:rPr>
               <w:rFonts w:ascii="Cambria Math" w:hAnsi="Cambria Math"/>
             </w:rPr>
-            <m:t>=-</m:t>
-          </m:r>
-          <m:r>
-            <w:rPr>
-              <w:rFonts w:ascii="Cambria Math" w:hAnsi="Cambria Math"/>
-            </w:rPr>
-            <m:t> </m:t>
-          </m:r>
-          <m:r>
-            <w:rPr>
-              <w:rFonts w:ascii="Cambria Math" w:hAnsi="Cambria Math"/>
-            </w:rPr>
-            <m:t>C</m:t>
+            <m:t>=- C</m:t>
           </m:r>
           <m:sSup>
             <m:sSupPr>
@@ -2753,13 +3121,7 @@
             <w:rPr>
               <w:rFonts w:ascii="Cambria Math" w:hAnsi="Cambria Math"/>
             </w:rPr>
-            <m:t>B</m:t>
-          </m:r>
-          <m:r>
-            <w:rPr>
-              <w:rFonts w:ascii="Cambria Math" w:hAnsi="Cambria Math"/>
-            </w:rPr>
-            <m:t> </m:t>
+            <m:t>B </m:t>
           </m:r>
           <m:sSub>
             <m:sSubPr>
@@ -2791,13 +3153,7 @@
             <w:rPr>
               <w:rFonts w:ascii="Cambria Math" w:hAnsi="Cambria Math"/>
             </w:rPr>
-            <m:t> </m:t>
-          </m:r>
-          <m:r>
-            <w:rPr>
-              <w:rFonts w:ascii="Cambria Math" w:hAnsi="Cambria Math"/>
-            </w:rPr>
-            <m:t>g</m:t>
+            <m:t> g</m:t>
           </m:r>
         </m:oMath>
       </m:oMathPara>
@@ -2858,13 +3214,7 @@
               <w:rPr>
                 <w:rFonts w:ascii="Cambria Math" w:hAnsi="Cambria Math"/>
               </w:rPr>
-              <m:t>=</m:t>
-            </m:r>
-            <m:r>
-              <w:rPr>
-                <w:rFonts w:ascii="Cambria Math" w:hAnsi="Cambria Math"/>
-              </w:rPr>
-              <m:t>g</m:t>
+              <m:t>=g</m:t>
             </m:r>
           </m:e>
           <m:sub>
@@ -2915,21 +3265,7 @@
               <w:rFonts w:ascii="Cambria Math" w:hAnsi="Cambria Math"/>
               <w:lang w:val="en-US"/>
             </w:rPr>
-            <m:t>-</m:t>
-          </m:r>
-          <m:r>
-            <w:rPr>
-              <w:rFonts w:ascii="Cambria Math" w:hAnsi="Cambria Math"/>
-              <w:lang w:val="en-US"/>
-            </w:rPr>
-            <m:t> </m:t>
-          </m:r>
-          <m:r>
-            <w:rPr>
-              <w:rFonts w:ascii="Cambria Math" w:hAnsi="Cambria Math"/>
-              <w:lang w:val="en-US"/>
-            </w:rPr>
-            <m:t>C</m:t>
+            <m:t>- C</m:t>
           </m:r>
           <m:sSup>
             <m:sSupPr>
@@ -2978,14 +3314,7 @@
               <w:rFonts w:ascii="Cambria Math" w:hAnsi="Cambria Math"/>
               <w:lang w:val="en-US"/>
             </w:rPr>
-            <m:t>B</m:t>
-          </m:r>
-          <m:r>
-            <w:rPr>
-              <w:rFonts w:ascii="Cambria Math" w:hAnsi="Cambria Math"/>
-              <w:lang w:val="en-US"/>
-            </w:rPr>
-            <m:t> </m:t>
+            <m:t>B </m:t>
           </m:r>
           <m:sSub>
             <m:sSubPr>
@@ -3073,14 +3402,7 @@
               <w:rFonts w:ascii="Cambria Math" w:hAnsi="Cambria Math"/>
               <w:lang w:val="en-US"/>
             </w:rPr>
-            <m:t>=-</m:t>
-          </m:r>
-          <m:r>
-            <w:rPr>
-              <w:rFonts w:ascii="Cambria Math" w:hAnsi="Cambria Math"/>
-              <w:lang w:val="en-US"/>
-            </w:rPr>
-            <m:t> </m:t>
+            <m:t>=- </m:t>
           </m:r>
           <m:f>
             <m:fPr>
@@ -3186,27 +3508,27 @@
       <w:r>
         <w:rPr>
           <w:noProof/>
+          <w:lang w:eastAsia="ru-RU"/>
         </w:rPr>
         <w:drawing>
-          <wp:inline distT="0" distB="0" distL="0" distR="0" wp14:anchorId="6B247D48" wp14:editId="71E72592">
+          <wp:inline distT="0" distB="0" distL="0" distR="0" wp14:anchorId="70D11407" wp14:editId="1FFA4881">
             <wp:extent cx="5457143" cy="1380952"/>
             <wp:effectExtent l="0" t="0" r="0" b="0"/>
-            <wp:docPr id="23" name="Рисунок 23"/>
+            <wp:docPr id="1034" name="Рисунок 23"/>
             <wp:cNvGraphicFramePr>
-              <a:graphicFrameLocks xmlns:a="http://schemas.openxmlformats.org/drawingml/2006/main" noChangeAspect="1"/>
+              <a:graphicFrameLocks xmlns:a="http://schemas.openxmlformats.org/drawingml/2006/main"/>
             </wp:cNvGraphicFramePr>
             <a:graphic xmlns:a="http://schemas.openxmlformats.org/drawingml/2006/main">
               <a:graphicData uri="http://schemas.openxmlformats.org/drawingml/2006/picture">
                 <pic:pic xmlns:pic="http://schemas.openxmlformats.org/drawingml/2006/picture">
                   <pic:nvPicPr>
-                    <pic:cNvPr id="1" name=""/>
+                    <pic:cNvPr id="8" name="Рисунок 23"/>
                     <pic:cNvPicPr/>
                   </pic:nvPicPr>
                   <pic:blipFill>
-                    <a:blip r:embed="rId16"/>
-                    <a:stretch>
-                      <a:fillRect/>
-                    </a:stretch>
+                    <a:blip r:embed="rId16" cstate="print"/>
+                    <a:srcRect/>
+                    <a:stretch/>
                   </pic:blipFill>
                   <pic:spPr>
                     <a:xfrm>
@@ -3227,16 +3549,33 @@
     <w:p>
       <w:pPr>
         <w:pStyle w:val="a3"/>
-        <w:rPr>
-          <w:lang w:val="en-US"/>
-        </w:rPr>
-      </w:pPr>
-    </w:p>
-    <w:p>
-      <w:pPr>
-        <w:pStyle w:val="a3"/>
         <w:ind w:firstLine="0"/>
         <w:jc w:val="center"/>
+      </w:pPr>
+      <w:r>
+        <w:t>Рисунок 8 – Расчет коэффициентов для случаев перерегулирования 0% и</w:t>
+      </w:r>
+      <w:r>
+        <w:t xml:space="preserve"> </w:t>
+      </w:r>
+      <w:r>
+        <w:t>30</w:t>
+      </w:r>
+      <w:r>
+        <w:t>%.</w:t>
+      </w:r>
+    </w:p>
+    <w:p>
+      <w:pPr>
+        <w:pStyle w:val="a3"/>
+        <w:ind w:firstLine="0"/>
+      </w:pPr>
+    </w:p>
+    <w:p>
+      <w:pPr>
+        <w:pStyle w:val="a3"/>
+        <w:ind w:firstLine="0"/>
+        <w:jc w:val="center"/>
         <w:rPr>
           <w:rStyle w:val="a4"/>
           <w:lang w:val="en-US"/>
@@ -3245,11 +3584,197 @@
       <w:r>
         <w:rPr>
           <w:noProof/>
+          <w:lang w:eastAsia="ru-RU"/>
         </w:rPr>
         <w:drawing>
-          <wp:inline distT="0" distB="0" distL="0" distR="0" wp14:anchorId="7960194F" wp14:editId="652F21C8">
-            <wp:extent cx="4131539" cy="551815"/>
+          <wp:inline distT="0" distB="0" distL="0" distR="0" wp14:anchorId="5FBC4F5C" wp14:editId="563D55BC">
+            <wp:extent cx="4131538" cy="551815"/>
             <wp:effectExtent l="0" t="0" r="2540" b="635"/>
+            <wp:docPr id="1035" name="Рисунок 1"/>
+            <wp:cNvGraphicFramePr>
+              <a:graphicFrameLocks xmlns:a="http://schemas.openxmlformats.org/drawingml/2006/main"/>
+            </wp:cNvGraphicFramePr>
+            <a:graphic xmlns:a="http://schemas.openxmlformats.org/drawingml/2006/main">
+              <a:graphicData uri="http://schemas.openxmlformats.org/drawingml/2006/picture">
+                <pic:pic xmlns:pic="http://schemas.openxmlformats.org/drawingml/2006/picture">
+                  <pic:nvPicPr>
+                    <pic:cNvPr id="9" name="Рисунок 1"/>
+                    <pic:cNvPicPr/>
+                  </pic:nvPicPr>
+                  <pic:blipFill>
+                    <a:blip r:embed="rId17" cstate="print"/>
+                    <a:srcRect/>
+                    <a:stretch/>
+                  </pic:blipFill>
+                  <pic:spPr>
+                    <a:xfrm>
+                      <a:off x="0" y="0"/>
+                      <a:ext cx="4131538" cy="551815"/>
+                    </a:xfrm>
+                    <a:prstGeom prst="rect">
+                      <a:avLst/>
+                    </a:prstGeom>
+                  </pic:spPr>
+                </pic:pic>
+              </a:graphicData>
+            </a:graphic>
+          </wp:inline>
+        </w:drawing>
+      </w:r>
+    </w:p>
+    <w:p>
+      <w:pPr>
+        <w:pStyle w:val="a3"/>
+        <w:ind w:firstLine="0"/>
+        <w:jc w:val="center"/>
+      </w:pPr>
+      <w:r>
+        <w:t xml:space="preserve">Рисунок 9 – Окно вывода </w:t>
+      </w:r>
+      <w:r>
+        <w:t>рассчитанных масштабирующих коэффициента</w:t>
+      </w:r>
+      <w:r>
+        <w:t>.</w:t>
+      </w:r>
+    </w:p>
+    <w:p>
+      <w:pPr>
+        <w:pStyle w:val="a3"/>
+        <w:ind w:firstLine="0"/>
+        <w:jc w:val="center"/>
+        <w:rPr>
+          <w:rStyle w:val="a4"/>
+        </w:rPr>
+      </w:pPr>
+    </w:p>
+    <w:p>
+      <w:pPr>
+        <w:pStyle w:val="a3"/>
+        <w:ind w:firstLine="0"/>
+        <w:jc w:val="center"/>
+        <w:rPr>
+          <w:rStyle w:val="a4"/>
+        </w:rPr>
+      </w:pPr>
+    </w:p>
+    <w:p>
+      <w:pPr>
+        <w:pStyle w:val="a3"/>
+        <w:ind w:firstLine="0"/>
+        <w:jc w:val="center"/>
+        <w:rPr>
+          <w:rStyle w:val="a4"/>
+        </w:rPr>
+      </w:pPr>
+    </w:p>
+    <w:p>
+      <w:pPr>
+        <w:pStyle w:val="a3"/>
+        <w:ind w:firstLine="0"/>
+        <w:jc w:val="center"/>
+        <w:rPr>
+          <w:rStyle w:val="a4"/>
+        </w:rPr>
+      </w:pPr>
+    </w:p>
+    <w:p>
+      <w:pPr>
+        <w:pStyle w:val="a3"/>
+        <w:ind w:firstLine="0"/>
+        <w:jc w:val="center"/>
+        <w:rPr>
+          <w:rStyle w:val="a4"/>
+        </w:rPr>
+      </w:pPr>
+    </w:p>
+    <w:p>
+      <w:pPr>
+        <w:pStyle w:val="a3"/>
+        <w:ind w:firstLine="0"/>
+        <w:jc w:val="center"/>
+        <w:rPr>
+          <w:rStyle w:val="a4"/>
+        </w:rPr>
+      </w:pPr>
+    </w:p>
+    <w:p>
+      <w:pPr>
+        <w:pStyle w:val="a3"/>
+        <w:ind w:firstLine="0"/>
+        <w:jc w:val="center"/>
+        <w:rPr>
+          <w:rStyle w:val="a4"/>
+        </w:rPr>
+      </w:pPr>
+    </w:p>
+    <w:p>
+      <w:pPr>
+        <w:pStyle w:val="a3"/>
+        <w:numPr>
+          <w:ilvl w:val="0"/>
+          <w:numId w:val="2"/>
+        </w:numPr>
+        <w:rPr>
+          <w:b/>
+          <w:bCs/>
+        </w:rPr>
+      </w:pPr>
+      <w:r>
+        <w:rPr>
+          <w:b/>
+          <w:bCs/>
+        </w:rPr>
+        <w:lastRenderedPageBreak/>
+        <w:t xml:space="preserve">Проверка </w:t>
+      </w:r>
+      <w:r>
+        <w:rPr>
+          <w:b/>
+          <w:bCs/>
+        </w:rPr>
+        <w:t xml:space="preserve">рассчитанных </w:t>
+      </w:r>
+      <w:r>
+        <w:rPr>
+          <w:b/>
+          <w:bCs/>
+        </w:rPr>
+        <w:t xml:space="preserve">результатов </w:t>
+      </w:r>
+      <w:r>
+        <w:rPr>
+          <w:b/>
+          <w:bCs/>
+        </w:rPr>
+        <w:t xml:space="preserve">в </w:t>
+      </w:r>
+      <w:r>
+        <w:rPr>
+          <w:b/>
+          <w:bCs/>
+          <w:lang w:val="en-US"/>
+        </w:rPr>
+        <w:t>Simulink</w:t>
+      </w:r>
+    </w:p>
+    <w:p>
+      <w:pPr>
+        <w:pStyle w:val="a3"/>
+        <w:ind w:firstLine="0"/>
+        <w:jc w:val="center"/>
+        <w:rPr>
+          <w:rStyle w:val="a4"/>
+        </w:rPr>
+      </w:pPr>
+      <w:r>
+        <w:rPr>
+          <w:noProof/>
+        </w:rPr>
+        <w:drawing>
+          <wp:inline distT="0" distB="0" distL="0" distR="0" wp14:anchorId="324CF9BA" wp14:editId="735F3F42">
+            <wp:extent cx="5760085" cy="3381375"/>
+            <wp:effectExtent l="0" t="0" r="0" b="9525"/>
             <wp:docPr id="1" name="Рисунок 1"/>
             <wp:cNvGraphicFramePr>
               <a:graphicFrameLocks xmlns:a="http://schemas.openxmlformats.org/drawingml/2006/main" noChangeAspect="1"/>
@@ -3262,7 +3787,7 @@
                     <pic:cNvPicPr/>
                   </pic:nvPicPr>
                   <pic:blipFill>
-                    <a:blip r:embed="rId17"/>
+                    <a:blip r:embed="rId18"/>
                     <a:stretch>
                       <a:fillRect/>
                     </a:stretch>
@@ -3270,7 +3795,7 @@
                   <pic:spPr>
                     <a:xfrm>
                       <a:off x="0" y="0"/>
-                      <a:ext cx="4172099" cy="557232"/>
+                      <a:ext cx="5760085" cy="3381375"/>
                     </a:xfrm>
                     <a:prstGeom prst="rect">
                       <a:avLst/>
@@ -3288,10 +3813,28 @@
         <w:pStyle w:val="a3"/>
         <w:ind w:firstLine="0"/>
         <w:jc w:val="center"/>
-        <w:rPr>
-          <w:rStyle w:val="a4"/>
-        </w:rPr>
-      </w:pPr>
+      </w:pPr>
+      <w:r>
+        <w:t xml:space="preserve">Рисунок </w:t>
+      </w:r>
+      <w:r>
+        <w:t>10</w:t>
+      </w:r>
+      <w:r>
+        <w:t xml:space="preserve"> – </w:t>
+      </w:r>
+      <w:r>
+        <w:t xml:space="preserve">Собранная схема в </w:t>
+      </w:r>
+      <w:r>
+        <w:rPr>
+          <w:lang w:val="en-US"/>
+        </w:rPr>
+        <w:t>Simulink</w:t>
+      </w:r>
+      <w:r>
+        <w:t>.</w:t>
+      </w:r>
     </w:p>
     <w:p>
       <w:pPr>
@@ -3300,7 +3843,6 @@
         <w:jc w:val="center"/>
         <w:rPr>
           <w:rStyle w:val="a4"/>
-          <w:lang w:val="en-US"/>
         </w:rPr>
       </w:pPr>
     </w:p>
@@ -3311,12 +3853,107 @@
         <w:jc w:val="center"/>
         <w:rPr>
           <w:rStyle w:val="a4"/>
+        </w:rPr>
+      </w:pPr>
+      <w:r>
+        <w:rPr>
+          <w:noProof/>
+        </w:rPr>
+        <w:drawing>
+          <wp:inline distT="0" distB="0" distL="0" distR="0" wp14:anchorId="2E18BDC1" wp14:editId="7C69DFBD">
+            <wp:extent cx="5760085" cy="4191000"/>
+            <wp:effectExtent l="0" t="0" r="0" b="0"/>
+            <wp:docPr id="2" name="Рисунок 2"/>
+            <wp:cNvGraphicFramePr>
+              <a:graphicFrameLocks xmlns:a="http://schemas.openxmlformats.org/drawingml/2006/main" noChangeAspect="1"/>
+            </wp:cNvGraphicFramePr>
+            <a:graphic xmlns:a="http://schemas.openxmlformats.org/drawingml/2006/main">
+              <a:graphicData uri="http://schemas.openxmlformats.org/drawingml/2006/picture">
+                <pic:pic xmlns:pic="http://schemas.openxmlformats.org/drawingml/2006/picture">
+                  <pic:nvPicPr>
+                    <pic:cNvPr id="1" name=""/>
+                    <pic:cNvPicPr/>
+                  </pic:nvPicPr>
+                  <pic:blipFill>
+                    <a:blip r:embed="rId19"/>
+                    <a:stretch>
+                      <a:fillRect/>
+                    </a:stretch>
+                  </pic:blipFill>
+                  <pic:spPr>
+                    <a:xfrm>
+                      <a:off x="0" y="0"/>
+                      <a:ext cx="5760085" cy="4191000"/>
+                    </a:xfrm>
+                    <a:prstGeom prst="rect">
+                      <a:avLst/>
+                    </a:prstGeom>
+                  </pic:spPr>
+                </pic:pic>
+              </a:graphicData>
+            </a:graphic>
+          </wp:inline>
+        </w:drawing>
+      </w:r>
+    </w:p>
+    <w:p>
+      <w:pPr>
+        <w:pStyle w:val="a3"/>
+        <w:ind w:firstLine="0"/>
+        <w:jc w:val="center"/>
+      </w:pPr>
+      <w:r>
+        <w:t>Рисунок 1</w:t>
+      </w:r>
+      <w:r>
+        <w:t>1</w:t>
+      </w:r>
+      <w:r>
+        <w:t xml:space="preserve"> – </w:t>
+      </w:r>
+      <w:r>
+        <w:t xml:space="preserve">окно </w:t>
+      </w:r>
+      <w:r>
+        <w:rPr>
           <w:lang w:val="en-US"/>
         </w:rPr>
-      </w:pPr>
+        <w:t>Scope</w:t>
+      </w:r>
+      <w:r>
+        <w:t>.</w:t>
+      </w:r>
+    </w:p>
+    <w:p>
+      <w:pPr>
+        <w:pStyle w:val="a3"/>
+        <w:rPr>
+          <w:rStyle w:val="a4"/>
+          <w:lang w:val="en-US"/>
+        </w:rPr>
+      </w:pPr>
+      <w:r>
+        <w:rPr>
+          <w:rStyle w:val="a4"/>
+        </w:rPr>
+        <w:t>Перерегулирование составило</w:t>
+      </w:r>
+      <w:r>
+        <w:rPr>
+          <w:rStyle w:val="a4"/>
+        </w:rPr>
+        <w:t>:</w:t>
+      </w:r>
+      <w:r>
+        <w:rPr>
+          <w:rStyle w:val="a4"/>
+          <w:lang w:val="en-US"/>
+        </w:rPr>
+        <w:t xml:space="preserve"> 1.297 – 1 = 29.7%.</w:t>
+      </w:r>
     </w:p>
     <w:sectPr>
-      <w:footerReference w:type="default" r:id="rId18"/>
+      <w:footerReference w:type="default" r:id="rId20"/>
       <w:pgSz w:w="11906" w:h="16838"/>
       <w:pgMar w:top="1134" w:right="1134" w:bottom="1134" w:left="1701" w:header="709" w:footer="709" w:gutter="0"/>
       <w:cols w:space="708"/>
@@ -3354,39 +3991,30 @@
 
 <file path=word/footer1.xml><?xml version="1.0" encoding="utf-8"?>
 <w:ftr xmlns:wpc="http://schemas.microsoft.com/office/word/2010/wordprocessingCanvas" xmlns:cx="http://schemas.microsoft.com/office/drawing/2014/chartex" xmlns:cx1="http://schemas.microsoft.com/office/drawing/2015/9/8/chartex" xmlns:cx2="http://schemas.microsoft.com/office/drawing/2015/10/21/chartex" xmlns:cx3="http://schemas.microsoft.com/office/drawing/2016/5/9/chartex" xmlns:cx4="http://schemas.microsoft.com/office/drawing/2016/5/10/chartex" xmlns:cx5="http://schemas.microsoft.com/office/drawing/2016/5/11/chartex" xmlns:cx6="http://schemas.microsoft.com/office/drawing/2016/5/12/chartex" xmlns:cx7="http://schemas.microsoft.com/office/drawing/2016/5/13/chartex" xmlns:cx8="http://schemas.microsoft.com/office/drawing/2016/5/14/chartex" xmlns:mc="http://schemas.openxmlformats.org/markup-compatibility/2006" xmlns:aink="http://schemas.microsoft.com/office/drawing/2016/ink" xmlns:am3d="http://schemas.microsoft.com/office/drawing/2017/model3d" xmlns:o="urn:schemas-microsoft-com:office:office" xmlns:r="http://schemas.openxmlformats.org/officeDocument/2006/relationships" xmlns:m="http://schemas.openxmlformats.org/officeDocument/2006/math" xmlns:v="urn:schemas-microsoft-com:vml" xmlns:wp14="http://schemas.microsoft.com/office/word/2010/wordprocessingDrawing" xmlns:wp="http://schemas.openxmlformats.org/drawingml/2006/wordprocessingDrawing" xmlns:w10="urn:schemas-microsoft-com:office:word" xmlns:w="http://schemas.openxmlformats.org/wordprocessingml/2006/main" xmlns:w14="http://schemas.microsoft.com/office/word/2010/wordml" xmlns:w15="http://schemas.microsoft.com/office/word/2012/wordml" xmlns:w16cex="http://schemas.microsoft.com/office/word/2018/wordml/cex" xmlns:w16cid="http://schemas.microsoft.com/office/word/2016/wordml/cid" xmlns:w16="http://schemas.microsoft.com/office/word/2018/wordml" xmlns:w16sdtdh="http://schemas.microsoft.com/office/word/2020/wordml/sdtdatahash" xmlns:w16se="http://schemas.microsoft.com/office/word/2015/wordml/symex" xmlns:wpg="http://schemas.microsoft.com/office/word/2010/wordprocessingGroup" xmlns:wpi="http://schemas.microsoft.com/office/word/2010/wordprocessingInk" xmlns:wne="http://schemas.microsoft.com/office/word/2006/wordml" xmlns:wps="http://schemas.microsoft.com/office/word/2010/wordprocessingShape" mc:Ignorable="w14 w15 w16se w16cid w16 w16cex w16sdtdh wp14">
-  <w:sdt>
-    <w:sdtPr>
-      <w:id w:val="-37754271"/>
-      <w:docPartObj>
-        <w:docPartGallery w:val="Page Numbers (Bottom of Page)"/>
-        <w:docPartUnique/>
-      </w:docPartObj>
-    </w:sdtPr>
-    <w:sdtEndPr/>
-    <w:sdtContent>
-      <w:p>
-        <w:pPr>
-          <w:pStyle w:val="ae"/>
-          <w:jc w:val="right"/>
-        </w:pPr>
-        <w:r>
-          <w:fldChar w:fldCharType="begin"/>
-        </w:r>
-        <w:r>
-          <w:instrText>PAGE   \* MERGEFORMAT</w:instrText>
-        </w:r>
-        <w:r>
-          <w:fldChar w:fldCharType="separate"/>
-        </w:r>
-        <w:r>
-          <w:t>2</w:t>
-        </w:r>
-        <w:r>
-          <w:fldChar w:fldCharType="end"/>
-        </w:r>
-      </w:p>
-    </w:sdtContent>
-  </w:sdt>
+  <w:p>
+    <w:pPr>
+      <w:pStyle w:val="ae"/>
+      <w:jc w:val="right"/>
+    </w:pPr>
+    <w:r>
+      <w:fldChar w:fldCharType="begin"/>
+    </w:r>
+    <w:r>
+      <w:instrText>PAGE   \* MERGEFORMAT</w:instrText>
+    </w:r>
+    <w:r>
+      <w:fldChar w:fldCharType="separate"/>
+    </w:r>
+    <w:r>
+      <w:rPr>
+        <w:noProof/>
+      </w:rPr>
+      <w:t>5</w:t>
+    </w:r>
+    <w:r>
+      <w:fldChar w:fldCharType="end"/>
+    </w:r>
+  </w:p>
   <w:p>
     <w:pPr>
       <w:pStyle w:val="ae"/>
@@ -3423,7 +4051,179 @@
 <file path=word/numbering.xml><?xml version="1.0" encoding="utf-8"?>
 <w:numbering xmlns:wpc="http://schemas.microsoft.com/office/word/2010/wordprocessingCanvas" xmlns:cx="http://schemas.microsoft.com/office/drawing/2014/chartex" xmlns:cx1="http://schemas.microsoft.com/office/drawing/2015/9/8/chartex" xmlns:cx2="http://schemas.microsoft.com/office/drawing/2015/10/21/chartex" xmlns:cx3="http://schemas.microsoft.com/office/drawing/2016/5/9/chartex" xmlns:cx4="http://schemas.microsoft.com/office/drawing/2016/5/10/chartex" xmlns:cx5="http://schemas.microsoft.com/office/drawing/2016/5/11/chartex" xmlns:cx6="http://schemas.microsoft.com/office/drawing/2016/5/12/chartex" xmlns:cx7="http://schemas.microsoft.com/office/drawing/2016/5/13/chartex" xmlns:cx8="http://schemas.microsoft.com/office/drawing/2016/5/14/chartex" xmlns:mc="http://schemas.openxmlformats.org/markup-compatibility/2006" xmlns:aink="http://schemas.microsoft.com/office/drawing/2016/ink" xmlns:am3d="http://schemas.microsoft.com/office/drawing/2017/model3d" xmlns:o="urn:schemas-microsoft-com:office:office" xmlns:r="http://schemas.openxmlformats.org/officeDocument/2006/relationships" xmlns:m="http://schemas.openxmlformats.org/officeDocument/2006/math" xmlns:v="urn:schemas-microsoft-com:vml" xmlns:wp14="http://schemas.microsoft.com/office/word/2010/wordprocessingDrawing" xmlns:wp="http://schemas.openxmlformats.org/drawingml/2006/wordprocessingDrawing" xmlns:w10="urn:schemas-microsoft-com:office:word" xmlns:w="http://schemas.openxmlformats.org/wordprocessingml/2006/main" xmlns:w14="http://schemas.microsoft.com/office/word/2010/wordml" xmlns:w15="http://schemas.microsoft.com/office/word/2012/wordml" xmlns:w16cex="http://schemas.microsoft.com/office/word/2018/wordml/cex" xmlns:w16cid="http://schemas.microsoft.com/office/word/2016/wordml/cid" xmlns:w16="http://schemas.microsoft.com/office/word/2018/wordml" xmlns:w16sdtdh="http://schemas.microsoft.com/office/word/2020/wordml/sdtdatahash" xmlns:w16se="http://schemas.microsoft.com/office/word/2015/wordml/symex" xmlns:wpg="http://schemas.microsoft.com/office/word/2010/wordprocessingGroup" xmlns:wpi="http://schemas.microsoft.com/office/word/2010/wordprocessingInk" xmlns:wne="http://schemas.microsoft.com/office/word/2006/wordml" xmlns:wps="http://schemas.microsoft.com/office/word/2010/wordprocessingShape" mc:Ignorable="w14 w15 w16se w16cid w16 w16cex w16sdtdh wp14">
   <w:abstractNum w:abstractNumId="0" w15:restartNumberingAfterBreak="0">
-    <w:nsid w:val="17C467F5"/>
+    <w:nsid w:val="00000001"/>
+    <w:multiLevelType w:val="hybridMultilevel"/>
+    <w:tmpl w:val="681C95BC"/>
+    <w:lvl w:ilvl="0" w:tplc="0419000F">
+      <w:start w:val="1"/>
+      <w:numFmt w:val="decimal"/>
+      <w:lvlText w:val="%1."/>
+      <w:lvlJc w:val="left"/>
+      <w:pPr>
+        <w:ind w:left="1068" w:hanging="360"/>
+      </w:pPr>
+    </w:lvl>
+    <w:lvl w:ilvl="1" w:tplc="04190019" w:tentative="1">
+      <w:start w:val="1"/>
+      <w:numFmt w:val="lowerLetter"/>
+      <w:lvlText w:val="%2."/>
+      <w:lvlJc w:val="left"/>
+      <w:pPr>
+        <w:ind w:left="1788" w:hanging="360"/>
+      </w:pPr>
+    </w:lvl>
+    <w:lvl w:ilvl="2" w:tplc="0419001B" w:tentative="1">
+      <w:start w:val="1"/>
+      <w:numFmt w:val="lowerRoman"/>
+      <w:lvlText w:val="%3."/>
+      <w:lvlJc w:val="right"/>
+      <w:pPr>
+        <w:ind w:left="2508" w:hanging="180"/>
+      </w:pPr>
+    </w:lvl>
+    <w:lvl w:ilvl="3" w:tplc="0419000F" w:tentative="1">
+      <w:start w:val="1"/>
+      <w:numFmt w:val="decimal"/>
+      <w:lvlText w:val="%4."/>
+      <w:lvlJc w:val="left"/>
+      <w:pPr>
+        <w:ind w:left="3228" w:hanging="360"/>
+      </w:pPr>
+    </w:lvl>
+    <w:lvl w:ilvl="4" w:tplc="04190019" w:tentative="1">
+      <w:start w:val="1"/>
+      <w:numFmt w:val="lowerLetter"/>
+      <w:lvlText w:val="%5."/>
+      <w:lvlJc w:val="left"/>
+      <w:pPr>
+        <w:ind w:left="3948" w:hanging="360"/>
+      </w:pPr>
+    </w:lvl>
+    <w:lvl w:ilvl="5" w:tplc="0419001B" w:tentative="1">
+      <w:start w:val="1"/>
+      <w:numFmt w:val="lowerRoman"/>
+      <w:lvlText w:val="%6."/>
+      <w:lvlJc w:val="right"/>
+      <w:pPr>
+        <w:ind w:left="4668" w:hanging="180"/>
+      </w:pPr>
+    </w:lvl>
+    <w:lvl w:ilvl="6" w:tplc="0419000F" w:tentative="1">
+      <w:start w:val="1"/>
+      <w:numFmt w:val="decimal"/>
+      <w:lvlText w:val="%7."/>
+      <w:lvlJc w:val="left"/>
+      <w:pPr>
+        <w:ind w:left="5388" w:hanging="360"/>
+      </w:pPr>
+    </w:lvl>
+    <w:lvl w:ilvl="7" w:tplc="04190019" w:tentative="1">
+      <w:start w:val="1"/>
+      <w:numFmt w:val="lowerLetter"/>
+      <w:lvlText w:val="%8."/>
+      <w:lvlJc w:val="left"/>
+      <w:pPr>
+        <w:ind w:left="6108" w:hanging="360"/>
+      </w:pPr>
+    </w:lvl>
+    <w:lvl w:ilvl="8" w:tplc="0419001B" w:tentative="1">
+      <w:start w:val="1"/>
+      <w:numFmt w:val="lowerRoman"/>
+      <w:lvlText w:val="%9."/>
+      <w:lvlJc w:val="right"/>
+      <w:pPr>
+        <w:ind w:left="6828" w:hanging="180"/>
+      </w:pPr>
+    </w:lvl>
+  </w:abstractNum>
+  <w:abstractNum w:abstractNumId="1" w15:restartNumberingAfterBreak="0">
+    <w:nsid w:val="563F05EE"/>
+    <w:multiLevelType w:val="hybridMultilevel"/>
+    <w:tmpl w:val="C5700126"/>
+    <w:lvl w:ilvl="0" w:tplc="0419000F">
+      <w:start w:val="1"/>
+      <w:numFmt w:val="decimal"/>
+      <w:lvlText w:val="%1."/>
+      <w:lvlJc w:val="left"/>
+      <w:pPr>
+        <w:ind w:left="1068" w:hanging="360"/>
+      </w:pPr>
+    </w:lvl>
+    <w:lvl w:ilvl="1" w:tplc="04190019" w:tentative="1">
+      <w:start w:val="1"/>
+      <w:numFmt w:val="lowerLetter"/>
+      <w:lvlText w:val="%2."/>
+      <w:lvlJc w:val="left"/>
+      <w:pPr>
+        <w:ind w:left="1788" w:hanging="360"/>
+      </w:pPr>
+    </w:lvl>
+    <w:lvl w:ilvl="2" w:tplc="0419001B" w:tentative="1">
+      <w:start w:val="1"/>
+      <w:numFmt w:val="lowerRoman"/>
+      <w:lvlText w:val="%3."/>
+      <w:lvlJc w:val="right"/>
+      <w:pPr>
+        <w:ind w:left="2508" w:hanging="180"/>
+      </w:pPr>
+    </w:lvl>
+    <w:lvl w:ilvl="3" w:tplc="0419000F" w:tentative="1">
+      <w:start w:val="1"/>
+      <w:numFmt w:val="decimal"/>
+      <w:lvlText w:val="%4."/>
+      <w:lvlJc w:val="left"/>
+      <w:pPr>
+        <w:ind w:left="3228" w:hanging="360"/>
+      </w:pPr>
+    </w:lvl>
+    <w:lvl w:ilvl="4" w:tplc="04190019" w:tentative="1">
+      <w:start w:val="1"/>
+      <w:numFmt w:val="lowerLetter"/>
+      <w:lvlText w:val="%5."/>
+      <w:lvlJc w:val="left"/>
+      <w:pPr>
+        <w:ind w:left="3948" w:hanging="360"/>
+      </w:pPr>
+    </w:lvl>
+    <w:lvl w:ilvl="5" w:tplc="0419001B" w:tentative="1">
+      <w:start w:val="1"/>
+      <w:numFmt w:val="lowerRoman"/>
+      <w:lvlText w:val="%6."/>
+      <w:lvlJc w:val="right"/>
+      <w:pPr>
+        <w:ind w:left="4668" w:hanging="180"/>
+      </w:pPr>
+    </w:lvl>
+    <w:lvl w:ilvl="6" w:tplc="0419000F" w:tentative="1">
+      <w:start w:val="1"/>
+      <w:numFmt w:val="decimal"/>
+      <w:lvlText w:val="%7."/>
+      <w:lvlJc w:val="left"/>
+      <w:pPr>
+        <w:ind w:left="5388" w:hanging="360"/>
+      </w:pPr>
+    </w:lvl>
+    <w:lvl w:ilvl="7" w:tplc="04190019" w:tentative="1">
+      <w:start w:val="1"/>
+      <w:numFmt w:val="lowerLetter"/>
+      <w:lvlText w:val="%8."/>
+      <w:lvlJc w:val="left"/>
+      <w:pPr>
+        <w:ind w:left="6108" w:hanging="360"/>
+      </w:pPr>
+    </w:lvl>
+    <w:lvl w:ilvl="8" w:tplc="0419001B" w:tentative="1">
+      <w:start w:val="1"/>
+      <w:numFmt w:val="lowerRoman"/>
+      <w:lvlText w:val="%9."/>
+      <w:lvlJc w:val="right"/>
+      <w:pPr>
+        <w:ind w:left="6828" w:hanging="180"/>
+      </w:pPr>
+    </w:lvl>
+  </w:abstractNum>
+  <w:abstractNum w:abstractNumId="2" w15:restartNumberingAfterBreak="0">
+    <w:nsid w:val="5FD2565B"/>
     <w:multiLevelType w:val="hybridMultilevel"/>
     <w:tmpl w:val="B9407F26"/>
     <w:lvl w:ilvl="0" w:tplc="0419000F">
@@ -3508,99 +4308,15 @@
       </w:pPr>
     </w:lvl>
   </w:abstractNum>
-  <w:abstractNum w:abstractNumId="1" w15:restartNumberingAfterBreak="0">
-    <w:nsid w:val="7BFD7F71"/>
-    <w:multiLevelType w:val="hybridMultilevel"/>
-    <w:tmpl w:val="C5700126"/>
-    <w:lvl w:ilvl="0" w:tplc="0419000F">
-      <w:start w:val="1"/>
-      <w:numFmt w:val="decimal"/>
-      <w:lvlText w:val="%1."/>
-      <w:lvlJc w:val="left"/>
-      <w:pPr>
-        <w:ind w:left="1068" w:hanging="360"/>
-      </w:pPr>
-    </w:lvl>
-    <w:lvl w:ilvl="1" w:tplc="04190019" w:tentative="1">
-      <w:start w:val="1"/>
-      <w:numFmt w:val="lowerLetter"/>
-      <w:lvlText w:val="%2."/>
-      <w:lvlJc w:val="left"/>
-      <w:pPr>
-        <w:ind w:left="1788" w:hanging="360"/>
-      </w:pPr>
-    </w:lvl>
-    <w:lvl w:ilvl="2" w:tplc="0419001B" w:tentative="1">
-      <w:start w:val="1"/>
-      <w:numFmt w:val="lowerRoman"/>
-      <w:lvlText w:val="%3."/>
-      <w:lvlJc w:val="right"/>
-      <w:pPr>
-        <w:ind w:left="2508" w:hanging="180"/>
-      </w:pPr>
-    </w:lvl>
-    <w:lvl w:ilvl="3" w:tplc="0419000F" w:tentative="1">
-      <w:start w:val="1"/>
-      <w:numFmt w:val="decimal"/>
-      <w:lvlText w:val="%4."/>
-      <w:lvlJc w:val="left"/>
-      <w:pPr>
-        <w:ind w:left="3228" w:hanging="360"/>
-      </w:pPr>
-    </w:lvl>
-    <w:lvl w:ilvl="4" w:tplc="04190019" w:tentative="1">
-      <w:start w:val="1"/>
-      <w:numFmt w:val="lowerLetter"/>
-      <w:lvlText w:val="%5."/>
-      <w:lvlJc w:val="left"/>
-      <w:pPr>
-        <w:ind w:left="3948" w:hanging="360"/>
-      </w:pPr>
-    </w:lvl>
-    <w:lvl w:ilvl="5" w:tplc="0419001B" w:tentative="1">
-      <w:start w:val="1"/>
-      <w:numFmt w:val="lowerRoman"/>
-      <w:lvlText w:val="%6."/>
-      <w:lvlJc w:val="right"/>
-      <w:pPr>
-        <w:ind w:left="4668" w:hanging="180"/>
-      </w:pPr>
-    </w:lvl>
-    <w:lvl w:ilvl="6" w:tplc="0419000F" w:tentative="1">
-      <w:start w:val="1"/>
-      <w:numFmt w:val="decimal"/>
-      <w:lvlText w:val="%7."/>
-      <w:lvlJc w:val="left"/>
-      <w:pPr>
-        <w:ind w:left="5388" w:hanging="360"/>
-      </w:pPr>
-    </w:lvl>
-    <w:lvl w:ilvl="7" w:tplc="04190019" w:tentative="1">
-      <w:start w:val="1"/>
-      <w:numFmt w:val="lowerLetter"/>
-      <w:lvlText w:val="%8."/>
-      <w:lvlJc w:val="left"/>
-      <w:pPr>
-        <w:ind w:left="6108" w:hanging="360"/>
-      </w:pPr>
-    </w:lvl>
-    <w:lvl w:ilvl="8" w:tplc="0419001B" w:tentative="1">
-      <w:start w:val="1"/>
-      <w:numFmt w:val="lowerRoman"/>
-      <w:lvlText w:val="%9."/>
-      <w:lvlJc w:val="right"/>
-      <w:pPr>
-        <w:ind w:left="6828" w:hanging="180"/>
-      </w:pPr>
-    </w:lvl>
-  </w:abstractNum>
   <w:num w:numId="1">
+    <w:abstractNumId w:val="2"/>
+  </w:num>
+  <w:num w:numId="2">
     <w:abstractNumId w:val="0"/>
   </w:num>
-  <w:num w:numId="2">
+  <w:num w:numId="3">
     <w:abstractNumId w:val="1"/>
   </w:num>
-  <w:numIdMacAtCleanup w:val="2"/>
 </w:numbering>
 </file>
 
@@ -3609,7 +4325,7 @@
   <w:docDefaults>
     <w:rPrDefault>
       <w:rPr>
-        <w:rFonts w:asciiTheme="minorHAnsi" w:eastAsiaTheme="minorHAnsi" w:hAnsiTheme="minorHAnsi" w:cstheme="minorBidi"/>
+        <w:rFonts w:ascii="Calibri" w:eastAsia="Calibri" w:hAnsi="Calibri" w:cs="SimSun"/>
         <w:sz w:val="22"/>
         <w:szCs w:val="22"/>
         <w:lang w:val="ru-RU" w:eastAsia="en-US" w:bidi="ar-SA"/>
@@ -3727,7 +4443,6 @@
     <w:lsdException w:name="HTML Sample" w:semiHidden="1" w:unhideWhenUsed="1"/>
     <w:lsdException w:name="HTML Typewriter" w:semiHidden="1" w:unhideWhenUsed="1"/>
     <w:lsdException w:name="HTML Variable" w:semiHidden="1" w:unhideWhenUsed="1"/>
-    <w:lsdException w:name="Normal Table" w:semiHidden="1" w:unhideWhenUsed="1"/>
     <w:lsdException w:name="annotation subject" w:semiHidden="1" w:unhideWhenUsed="1"/>
     <w:lsdException w:name="No List" w:semiHidden="1" w:unhideWhenUsed="1"/>
     <w:lsdException w:name="Outline List 1" w:semiHidden="1" w:unhideWhenUsed="1"/>
@@ -3770,11 +4485,8 @@
     <w:lsdException w:name="Table Contemporary" w:semiHidden="1" w:unhideWhenUsed="1"/>
     <w:lsdException w:name="Table Elegant" w:semiHidden="1" w:unhideWhenUsed="1"/>
     <w:lsdException w:name="Table Professional" w:semiHidden="1" w:unhideWhenUsed="1"/>
-    <w:lsdException w:name="Table Subtle 1" w:semiHidden="1" w:unhideWhenUsed="1"/>
     <w:lsdException w:name="Table Subtle 2" w:semiHidden="1" w:unhideWhenUsed="1"/>
     <w:lsdException w:name="Table Web 1" w:semiHidden="1" w:unhideWhenUsed="1"/>
-    <w:lsdException w:name="Table Web 2" w:semiHidden="1" w:unhideWhenUsed="1"/>
-    <w:lsdException w:name="Table Web 3" w:semiHidden="1" w:unhideWhenUsed="1"/>
     <w:lsdException w:name="Balloon Text" w:semiHidden="1" w:unhideWhenUsed="1"/>
     <w:lsdException w:name="Table Grid" w:uiPriority="39"/>
     <w:lsdException w:name="Table Theme" w:semiHidden="1" w:unhideWhenUsed="1"/>
@@ -4010,7 +4722,6 @@
     <w:link w:val="10"/>
     <w:uiPriority w:val="9"/>
     <w:qFormat/>
-    <w:rsid w:val="006753B3"/>
     <w:pPr>
       <w:keepNext/>
       <w:keepLines/>
@@ -4018,8 +4729,8 @@
       <w:outlineLvl w:val="0"/>
     </w:pPr>
     <w:rPr>
-      <w:rFonts w:asciiTheme="majorHAnsi" w:eastAsiaTheme="majorEastAsia" w:hAnsiTheme="majorHAnsi" w:cstheme="majorBidi"/>
-      <w:color w:val="2F5496" w:themeColor="accent1" w:themeShade="BF"/>
+      <w:rFonts w:ascii="Calibri Light" w:eastAsia="SimSun" w:hAnsi="Calibri Light"/>
+      <w:color w:val="2F5496"/>
       <w:sz w:val="32"/>
       <w:szCs w:val="32"/>
     </w:rPr>
@@ -4030,9 +4741,7 @@
     <w:next w:val="a"/>
     <w:link w:val="20"/>
     <w:uiPriority w:val="9"/>
-    <w:unhideWhenUsed/>
     <w:qFormat/>
-    <w:rsid w:val="007679DC"/>
     <w:pPr>
       <w:keepNext/>
       <w:keepLines/>
@@ -4040,8 +4749,8 @@
       <w:outlineLvl w:val="1"/>
     </w:pPr>
     <w:rPr>
-      <w:rFonts w:asciiTheme="majorHAnsi" w:eastAsiaTheme="majorEastAsia" w:hAnsiTheme="majorHAnsi" w:cstheme="majorBidi"/>
-      <w:color w:val="2F5496" w:themeColor="accent1" w:themeShade="BF"/>
+      <w:rFonts w:ascii="Calibri Light" w:eastAsia="SimSun" w:hAnsi="Calibri Light"/>
+      <w:color w:val="2F5496"/>
       <w:sz w:val="26"/>
       <w:szCs w:val="26"/>
     </w:rPr>
@@ -4052,10 +4761,7 @@
     <w:next w:val="a"/>
     <w:link w:val="30"/>
     <w:uiPriority w:val="9"/>
-    <w:semiHidden/>
-    <w:unhideWhenUsed/>
     <w:qFormat/>
-    <w:rsid w:val="00AB648B"/>
     <w:pPr>
       <w:keepNext/>
       <w:keepLines/>
@@ -4063,8 +4769,8 @@
       <w:outlineLvl w:val="2"/>
     </w:pPr>
     <w:rPr>
-      <w:rFonts w:asciiTheme="majorHAnsi" w:eastAsiaTheme="majorEastAsia" w:hAnsiTheme="majorHAnsi" w:cstheme="majorBidi"/>
-      <w:color w:val="1F3763" w:themeColor="accent1" w:themeShade="7F"/>
+      <w:rFonts w:ascii="Calibri Light" w:eastAsia="SimSun" w:hAnsi="Calibri Light"/>
+      <w:color w:val="1F3763"/>
       <w:sz w:val="24"/>
       <w:szCs w:val="24"/>
     </w:rPr>
@@ -4101,7 +4807,6 @@
     <w:basedOn w:val="a"/>
     <w:link w:val="a4"/>
     <w:qFormat/>
-    <w:rsid w:val="004A0D91"/>
     <w:pPr>
       <w:spacing w:after="0" w:line="276" w:lineRule="auto"/>
       <w:ind w:firstLine="709"/>
@@ -4116,7 +4821,6 @@
     <w:name w:val="Курсовая Знак"/>
     <w:basedOn w:val="a0"/>
     <w:link w:val="a3"/>
-    <w:rsid w:val="004A0D91"/>
     <w:rPr>
       <w:rFonts w:ascii="Times New Roman" w:hAnsi="Times New Roman"/>
       <w:sz w:val="26"/>
@@ -4126,7 +4830,6 @@
     <w:name w:val="Table Grid"/>
     <w:basedOn w:val="a1"/>
     <w:uiPriority w:val="39"/>
-    <w:rsid w:val="00B54C60"/>
     <w:pPr>
       <w:spacing w:after="0" w:line="240" w:lineRule="auto"/>
     </w:pPr>
@@ -4145,8 +4848,6 @@
     <w:name w:val="Placeholder Text"/>
     <w:basedOn w:val="a0"/>
     <w:uiPriority w:val="99"/>
-    <w:semiHidden/>
-    <w:rsid w:val="00B54C60"/>
     <w:rPr>
       <w:color w:val="808080"/>
     </w:rPr>
@@ -4158,13 +4859,12 @@
     <w:link w:val="a8"/>
     <w:uiPriority w:val="10"/>
     <w:qFormat/>
-    <w:rsid w:val="00BE5DCC"/>
     <w:pPr>
       <w:spacing w:after="0" w:line="240" w:lineRule="auto"/>
       <w:contextualSpacing/>
     </w:pPr>
     <w:rPr>
-      <w:rFonts w:asciiTheme="majorHAnsi" w:eastAsiaTheme="majorEastAsia" w:hAnsiTheme="majorHAnsi" w:cstheme="majorBidi"/>
+      <w:rFonts w:ascii="Calibri Light" w:eastAsia="SimSun" w:hAnsi="Calibri Light"/>
       <w:spacing w:val="-10"/>
       <w:kern w:val="28"/>
       <w:sz w:val="56"/>
@@ -4176,9 +4876,8 @@
     <w:basedOn w:val="a0"/>
     <w:link w:val="a7"/>
     <w:uiPriority w:val="10"/>
-    <w:rsid w:val="00BE5DCC"/>
     <w:rPr>
-      <w:rFonts w:asciiTheme="majorHAnsi" w:eastAsiaTheme="majorEastAsia" w:hAnsiTheme="majorHAnsi" w:cstheme="majorBidi"/>
+      <w:rFonts w:ascii="Calibri Light" w:eastAsia="SimSun" w:hAnsi="Calibri Light" w:cs="SimSun"/>
       <w:spacing w:val="-10"/>
       <w:kern w:val="28"/>
       <w:sz w:val="56"/>
@@ -4190,7 +4889,6 @@
     <w:basedOn w:val="a0"/>
     <w:uiPriority w:val="22"/>
     <w:qFormat/>
-    <w:rsid w:val="00BE5DCC"/>
     <w:rPr>
       <w:b/>
       <w:bCs/>
@@ -4201,10 +4899,9 @@
     <w:basedOn w:val="a0"/>
     <w:link w:val="1"/>
     <w:uiPriority w:val="9"/>
-    <w:rsid w:val="006753B3"/>
     <w:rPr>
-      <w:rFonts w:asciiTheme="majorHAnsi" w:eastAsiaTheme="majorEastAsia" w:hAnsiTheme="majorHAnsi" w:cstheme="majorBidi"/>
-      <w:color w:val="2F5496" w:themeColor="accent1" w:themeShade="BF"/>
+      <w:rFonts w:ascii="Calibri Light" w:eastAsia="SimSun" w:hAnsi="Calibri Light" w:cs="SimSun"/>
+      <w:color w:val="2F5496"/>
       <w:sz w:val="32"/>
       <w:szCs w:val="32"/>
     </w:rPr>
@@ -4214,9 +4911,7 @@
     <w:basedOn w:val="1"/>
     <w:next w:val="a"/>
     <w:uiPriority w:val="39"/>
-    <w:unhideWhenUsed/>
     <w:qFormat/>
-    <w:rsid w:val="00A0065E"/>
     <w:pPr>
       <w:outlineLvl w:val="9"/>
     </w:pPr>
@@ -4228,10 +4923,7 @@
     <w:name w:val="toc 1"/>
     <w:basedOn w:val="a"/>
     <w:next w:val="a"/>
-    <w:autoRedefine/>
     <w:uiPriority w:val="39"/>
-    <w:unhideWhenUsed/>
-    <w:rsid w:val="00A0065E"/>
     <w:pPr>
       <w:spacing w:after="100"/>
     </w:pPr>
@@ -4240,10 +4932,8 @@
     <w:name w:val="Hyperlink"/>
     <w:basedOn w:val="a0"/>
     <w:uiPriority w:val="99"/>
-    <w:unhideWhenUsed/>
-    <w:rsid w:val="00A0065E"/>
     <w:rPr>
-      <w:color w:val="0563C1" w:themeColor="hyperlink"/>
+      <w:color w:val="0563C1"/>
       <w:u w:val="single"/>
     </w:rPr>
   </w:style>
@@ -4252,8 +4942,6 @@
     <w:basedOn w:val="a"/>
     <w:link w:val="ad"/>
     <w:uiPriority w:val="99"/>
-    <w:unhideWhenUsed/>
-    <w:rsid w:val="00C03E1A"/>
     <w:pPr>
       <w:tabs>
         <w:tab w:val="center" w:pos="4677"/>
@@ -4267,15 +4955,12 @@
     <w:basedOn w:val="a0"/>
     <w:link w:val="ac"/>
     <w:uiPriority w:val="99"/>
-    <w:rsid w:val="00C03E1A"/>
   </w:style>
   <w:style w:type="paragraph" w:styleId="ae">
     <w:name w:val="footer"/>
     <w:basedOn w:val="a"/>
     <w:link w:val="af"/>
     <w:uiPriority w:val="99"/>
-    <w:unhideWhenUsed/>
-    <w:rsid w:val="00C03E1A"/>
     <w:pPr>
       <w:tabs>
         <w:tab w:val="center" w:pos="4677"/>
@@ -4289,14 +4974,12 @@
     <w:basedOn w:val="a0"/>
     <w:link w:val="ae"/>
     <w:uiPriority w:val="99"/>
-    <w:rsid w:val="00C03E1A"/>
   </w:style>
   <w:style w:type="paragraph" w:styleId="af0">
     <w:name w:val="List Paragraph"/>
     <w:basedOn w:val="a"/>
     <w:uiPriority w:val="34"/>
     <w:qFormat/>
-    <w:rsid w:val="005D0B11"/>
     <w:pPr>
       <w:ind w:left="720"/>
       <w:contextualSpacing/>
@@ -4307,10 +4990,9 @@
     <w:basedOn w:val="a0"/>
     <w:link w:val="2"/>
     <w:uiPriority w:val="9"/>
-    <w:rsid w:val="007679DC"/>
     <w:rPr>
-      <w:rFonts w:asciiTheme="majorHAnsi" w:eastAsiaTheme="majorEastAsia" w:hAnsiTheme="majorHAnsi" w:cstheme="majorBidi"/>
-      <w:color w:val="2F5496" w:themeColor="accent1" w:themeShade="BF"/>
+      <w:rFonts w:ascii="Calibri Light" w:eastAsia="SimSun" w:hAnsi="Calibri Light" w:cs="SimSun"/>
+      <w:color w:val="2F5496"/>
       <w:sz w:val="26"/>
       <w:szCs w:val="26"/>
     </w:rPr>
@@ -4319,10 +5001,7 @@
     <w:name w:val="toc 2"/>
     <w:basedOn w:val="a"/>
     <w:next w:val="a"/>
-    <w:autoRedefine/>
     <w:uiPriority w:val="39"/>
-    <w:unhideWhenUsed/>
-    <w:rsid w:val="007679DC"/>
     <w:pPr>
       <w:spacing w:after="100"/>
       <w:ind w:left="220"/>
@@ -4331,23 +5010,19 @@
   <w:style w:type="character" w:customStyle="1" w:styleId="katex-mathml">
     <w:name w:val="katex-mathml"/>
     <w:basedOn w:val="a0"/>
-    <w:rsid w:val="00B93E44"/>
   </w:style>
   <w:style w:type="character" w:customStyle="1" w:styleId="mord">
     <w:name w:val="mord"/>
     <w:basedOn w:val="a0"/>
-    <w:rsid w:val="00B93E44"/>
   </w:style>
   <w:style w:type="character" w:customStyle="1" w:styleId="30">
     <w:name w:val="Заголовок 3 Знак"/>
     <w:basedOn w:val="a0"/>
     <w:link w:val="3"/>
     <w:uiPriority w:val="9"/>
-    <w:semiHidden/>
-    <w:rsid w:val="00AB648B"/>
     <w:rPr>
-      <w:rFonts w:asciiTheme="majorHAnsi" w:eastAsiaTheme="majorEastAsia" w:hAnsiTheme="majorHAnsi" w:cstheme="majorBidi"/>
-      <w:color w:val="1F3763" w:themeColor="accent1" w:themeShade="7F"/>
+      <w:rFonts w:ascii="Calibri Light" w:eastAsia="SimSun" w:hAnsi="Calibri Light" w:cs="SimSun"/>
+      <w:color w:val="1F3763"/>
       <w:sz w:val="24"/>
       <w:szCs w:val="24"/>
     </w:rPr>
@@ -4355,38 +5030,31 @@
   <w:style w:type="character" w:customStyle="1" w:styleId="mopen">
     <w:name w:val="mopen"/>
     <w:basedOn w:val="a0"/>
-    <w:rsid w:val="003A5A92"/>
   </w:style>
   <w:style w:type="character" w:customStyle="1" w:styleId="mclose">
     <w:name w:val="mclose"/>
     <w:basedOn w:val="a0"/>
-    <w:rsid w:val="003A5A92"/>
   </w:style>
   <w:style w:type="character" w:customStyle="1" w:styleId="mrel">
     <w:name w:val="mrel"/>
     <w:basedOn w:val="a0"/>
-    <w:rsid w:val="00584270"/>
   </w:style>
   <w:style w:type="character" w:customStyle="1" w:styleId="mbin">
     <w:name w:val="mbin"/>
     <w:basedOn w:val="a0"/>
-    <w:rsid w:val="00584270"/>
   </w:style>
   <w:style w:type="character" w:customStyle="1" w:styleId="vlist-s">
     <w:name w:val="vlist-s"/>
     <w:basedOn w:val="a0"/>
-    <w:rsid w:val="00584270"/>
   </w:style>
   <w:style w:type="character" w:customStyle="1" w:styleId="mop">
     <w:name w:val="mop"/>
     <w:basedOn w:val="a0"/>
-    <w:rsid w:val="00F93892"/>
   </w:style>
   <w:style w:type="paragraph" w:styleId="af1">
     <w:name w:val="No Spacing"/>
     <w:uiPriority w:val="1"/>
     <w:qFormat/>
-    <w:rsid w:val="00CD658E"/>
     <w:pPr>
       <w:spacing w:after="0" w:line="240" w:lineRule="auto"/>
     </w:pPr>
@@ -4394,7 +5062,6 @@
   <w:style w:type="paragraph" w:customStyle="1" w:styleId="ds-markdown-paragraph">
     <w:name w:val="ds-markdown-paragraph"/>
     <w:basedOn w:val="a"/>
-    <w:rsid w:val="00342735"/>
     <w:pPr>
       <w:spacing w:before="100" w:beforeAutospacing="1" w:after="100" w:afterAutospacing="1" w:line="240" w:lineRule="auto"/>
     </w:pPr>
@@ -4408,14 +5075,12 @@
   <w:style w:type="character" w:customStyle="1" w:styleId="mpunct">
     <w:name w:val="mpunct"/>
     <w:basedOn w:val="a0"/>
-    <w:rsid w:val="00983711"/>
   </w:style>
   <w:style w:type="character" w:styleId="af2">
     <w:name w:val="Emphasis"/>
     <w:basedOn w:val="a0"/>
     <w:uiPriority w:val="20"/>
     <w:qFormat/>
-    <w:rsid w:val="00580D63"/>
     <w:rPr>
       <w:i/>
       <w:iCs/>
@@ -4426,9 +5091,6 @@
     <w:basedOn w:val="a"/>
     <w:link w:val="HTML0"/>
     <w:uiPriority w:val="99"/>
-    <w:semiHidden/>
-    <w:unhideWhenUsed/>
-    <w:rsid w:val="006D02DE"/>
     <w:pPr>
       <w:tabs>
         <w:tab w:val="left" w:pos="916"/>
@@ -4462,8 +5124,6 @@
     <w:basedOn w:val="a0"/>
     <w:link w:val="HTML"/>
     <w:uiPriority w:val="99"/>
-    <w:semiHidden/>
-    <w:rsid w:val="006D02DE"/>
     <w:rPr>
       <w:rFonts w:ascii="Courier New" w:eastAsia="Times New Roman" w:hAnsi="Courier New" w:cs="Courier New"/>
       <w:sz w:val="20"/>
@@ -4474,15 +5134,14 @@
   <w:style w:type="character" w:customStyle="1" w:styleId="token">
     <w:name w:val="token"/>
     <w:basedOn w:val="a0"/>
-    <w:rsid w:val="006D02DE"/>
   </w:style>
 </w:styles>
 </file>
 
 <file path=word/theme/theme1.xml><?xml version="1.0" encoding="utf-8"?>
-<a:theme xmlns:a="http://schemas.openxmlformats.org/drawingml/2006/main" name="Тема Office">
+<a:theme xmlns:a="http://schemas.openxmlformats.org/drawingml/2006/main" name="Office Theme">
   <a:themeElements>
-    <a:clrScheme name="Стандартная">
+    <a:clrScheme name="Office">
       <a:dk1>
         <a:sysClr val="windowText" lastClr="000000"/>
       </a:dk1>
@@ -4490,44 +5149,44 @@
         <a:sysClr val="window" lastClr="FFFFFF"/>
       </a:lt1>
       <a:dk2>
-        <a:srgbClr val="44546A"/>
+        <a:srgbClr val="1F497D"/>
       </a:dk2>
       <a:lt2>
-        <a:srgbClr val="E7E6E6"/>
+        <a:srgbClr val="EEECE1"/>
       </a:lt2>
       <a:accent1>
-        <a:srgbClr val="4472C4"/>
+        <a:srgbClr val="4F81BD"/>
       </a:accent1>
       <a:accent2>
-        <a:srgbClr val="ED7D31"/>
+        <a:srgbClr val="C0504D"/>
       </a:accent2>
       <a:accent3>
-        <a:srgbClr val="A5A5A5"/>
+        <a:srgbClr val="9BBB59"/>
       </a:accent3>
       <a:accent4>
-        <a:srgbClr val="FFC000"/>
+        <a:srgbClr val="8064A2"/>
       </a:accent4>
       <a:accent5>
-        <a:srgbClr val="5B9BD5"/>
+        <a:srgbClr val="4BACC6"/>
       </a:accent5>
       <a:accent6>
-        <a:srgbClr val="70AD47"/>
+        <a:srgbClr val="F79646"/>
       </a:accent6>
       <a:hlink>
-        <a:srgbClr val="0563C1"/>
+        <a:srgbClr val="0000FF"/>
       </a:hlink>
       <a:folHlink>
-        <a:srgbClr val="954F72"/>
+        <a:srgbClr val="800080"/>
       </a:folHlink>
     </a:clrScheme>
-    <a:fontScheme name="Стандартная">
+    <a:fontScheme name="Office">
       <a:majorFont>
-        <a:latin typeface="Calibri Light" panose="020F0302020204030204"/>
+        <a:latin typeface="Cambria"/>
         <a:ea typeface=""/>
         <a:cs typeface=""/>
-        <a:font script="Jpan" typeface="游ゴシック Light"/>
+        <a:font script="Jpan" typeface="ＭＳ ゴシック"/>
         <a:font script="Hang" typeface="맑은 고딕"/>
-        <a:font script="Hans" typeface="等线 Light"/>
+        <a:font script="Hans" typeface="宋体"/>
         <a:font script="Hant" typeface="新細明體"/>
         <a:font script="Arab" typeface="Times New Roman"/>
         <a:font script="Hebr" typeface="Times New Roman"/>
@@ -4555,31 +5214,14 @@
         <a:font script="Viet" typeface="Times New Roman"/>
         <a:font script="Uigh" typeface="Microsoft Uighur"/>
         <a:font script="Geor" typeface="Sylfaen"/>
-        <a:font script="Armn" typeface="Arial"/>
-        <a:font script="Bugi" typeface="Leelawadee UI"/>
-        <a:font script="Bopo" typeface="Microsoft JhengHei"/>
-        <a:font script="Java" typeface="Javanese Text"/>
-        <a:font script="Lisu" typeface="Segoe UI"/>
-        <a:font script="Mymr" typeface="Myanmar Text"/>
-        <a:font script="Nkoo" typeface="Ebrima"/>
-        <a:font script="Olck" typeface="Nirmala UI"/>
-        <a:font script="Osma" typeface="Ebrima"/>
-        <a:font script="Phag" typeface="Phagspa"/>
-        <a:font script="Syrn" typeface="Estrangelo Edessa"/>
-        <a:font script="Syrj" typeface="Estrangelo Edessa"/>
-        <a:font script="Syre" typeface="Estrangelo Edessa"/>
-        <a:font script="Sora" typeface="Nirmala UI"/>
-        <a:font script="Tale" typeface="Microsoft Tai Le"/>
-        <a:font script="Talu" typeface="Microsoft New Tai Lue"/>
-        <a:font script="Tfng" typeface="Ebrima"/>
       </a:majorFont>
       <a:minorFont>
-        <a:latin typeface="Calibri" panose="020F0502020204030204"/>
+        <a:latin typeface="Calibri"/>
         <a:ea typeface=""/>
         <a:cs typeface=""/>
-        <a:font script="Jpan" typeface="游明朝"/>
+        <a:font script="Jpan" typeface="ＭＳ 明朝"/>
         <a:font script="Hang" typeface="맑은 고딕"/>
-        <a:font script="Hans" typeface="等线"/>
+        <a:font script="Hans" typeface="宋体"/>
         <a:font script="Hant" typeface="新細明體"/>
         <a:font script="Arab" typeface="Arial"/>
         <a:font script="Hebr" typeface="Arial"/>
@@ -4607,26 +5249,9 @@
         <a:font script="Viet" typeface="Arial"/>
         <a:font script="Uigh" typeface="Microsoft Uighur"/>
         <a:font script="Geor" typeface="Sylfaen"/>
-        <a:font script="Armn" typeface="Arial"/>
-        <a:font script="Bugi" typeface="Leelawadee UI"/>
-        <a:font script="Bopo" typeface="Microsoft JhengHei"/>
-        <a:font script="Java" typeface="Javanese Text"/>
-        <a:font script="Lisu" typeface="Segoe UI"/>
-        <a:font script="Mymr" typeface="Myanmar Text"/>
-        <a:font script="Nkoo" typeface="Ebrima"/>
-        <a:font script="Olck" typeface="Nirmala UI"/>
-        <a:font script="Osma" typeface="Ebrima"/>
-        <a:font script="Phag" typeface="Phagspa"/>
-        <a:font script="Syrn" typeface="Estrangelo Edessa"/>
-        <a:font script="Syrj" typeface="Estrangelo Edessa"/>
-        <a:font script="Syre" typeface="Estrangelo Edessa"/>
-        <a:font script="Sora" typeface="Nirmala UI"/>
-        <a:font script="Tale" typeface="Microsoft Tai Le"/>
-        <a:font script="Talu" typeface="Microsoft New Tai Lue"/>
-        <a:font script="Tfng" typeface="Ebrima"/>
       </a:minorFont>
     </a:fontScheme>
-    <a:fmtScheme name="Стандартная">
+    <a:fmtScheme name="Office">
       <a:fillStyleLst>
         <a:solidFill>
           <a:schemeClr val="phClr"/>
@@ -4635,142 +5260,166 @@
           <a:gsLst>
             <a:gs pos="0">
               <a:schemeClr val="phClr">
-                <a:lumMod val="110000"/>
-                <a:satMod val="105000"/>
-                <a:tint val="67000"/>
+                <a:tint val="50000"/>
+                <a:satMod val="300000"/>
               </a:schemeClr>
             </a:gs>
-            <a:gs pos="50000">
+            <a:gs pos="35000">
               <a:schemeClr val="phClr">
-                <a:lumMod val="105000"/>
-                <a:satMod val="103000"/>
-                <a:tint val="73000"/>
+                <a:tint val="37000"/>
+                <a:satMod val="300000"/>
               </a:schemeClr>
             </a:gs>
             <a:gs pos="100000">
               <a:schemeClr val="phClr">
-                <a:lumMod val="105000"/>
-                <a:satMod val="109000"/>
-                <a:tint val="81000"/>
+                <a:tint val="15000"/>
+                <a:satMod val="350000"/>
               </a:schemeClr>
             </a:gs>
           </a:gsLst>
-          <a:lin ang="5400000" scaled="0"/>
+          <a:lin ang="16200000" scaled="1"/>
         </a:gradFill>
         <a:gradFill rotWithShape="1">
           <a:gsLst>
             <a:gs pos="0">
               <a:schemeClr val="phClr">
-                <a:satMod val="103000"/>
-                <a:lumMod val="102000"/>
-                <a:tint val="94000"/>
+                <a:shade val="51000"/>
+                <a:satMod val="130000"/>
               </a:schemeClr>
             </a:gs>
-            <a:gs pos="50000">
+            <a:gs pos="80000">
               <a:schemeClr val="phClr">
-                <a:satMod val="110000"/>
-                <a:lumMod val="100000"/>
-                <a:shade val="100000"/>
+                <a:shade val="93000"/>
+                <a:satMod val="130000"/>
               </a:schemeClr>
             </a:gs>
             <a:gs pos="100000">
               <a:schemeClr val="phClr">
-                <a:lumMod val="99000"/>
-                <a:satMod val="120000"/>
-                <a:shade val="78000"/>
+                <a:shade val="94000"/>
+                <a:satMod val="135000"/>
               </a:schemeClr>
             </a:gs>
           </a:gsLst>
-          <a:lin ang="5400000" scaled="0"/>
+          <a:lin ang="16200000" scaled="0"/>
         </a:gradFill>
       </a:fillStyleLst>
       <a:lnStyleLst>
-        <a:ln w="6350" cap="flat" cmpd="sng" algn="ctr">
+        <a:ln w="9525" cap="flat" cmpd="sng" algn="ctr">
+          <a:solidFill>
+            <a:schemeClr val="phClr">
+              <a:shade val="95000"/>
+              <a:satMod val="105000"/>
+            </a:schemeClr>
+          </a:solidFill>
+          <a:prstDash val="solid"/>
+        </a:ln>
+        <a:ln w="25400" cap="flat" cmpd="sng" algn="ctr">
           <a:solidFill>
             <a:schemeClr val="phClr"/>
           </a:solidFill>
           <a:prstDash val="solid"/>
-          <a:miter lim="800000"/>
         </a:ln>
-        <a:ln w="12700" cap="flat" cmpd="sng" algn="ctr">
+        <a:ln w="38100" cap="flat" cmpd="sng" algn="ctr">
           <a:solidFill>
             <a:schemeClr val="phClr"/>
           </a:solidFill>
           <a:prstDash val="solid"/>
-          <a:miter lim="800000"/>
-        </a:ln>
-        <a:ln w="19050" cap="flat" cmpd="sng" algn="ctr">
-          <a:solidFill>
-            <a:schemeClr val="phClr"/>
-          </a:solidFill>
-          <a:prstDash val="solid"/>
-          <a:miter lim="800000"/>
         </a:ln>
       </a:lnStyleLst>
       <a:effectStyleLst>
         <a:effectStyle>
-          <a:effectLst/>
-        </a:effectStyle>
-        <a:effectStyle>
-          <a:effectLst/>
+          <a:effectLst>
+            <a:outerShdw blurRad="40000" dist="20000" dir="5400000" rotWithShape="0">
+              <a:srgbClr val="000000">
+                <a:alpha val="38000"/>
+              </a:srgbClr>
+            </a:outerShdw>
+          </a:effectLst>
         </a:effectStyle>
         <a:effectStyle>
           <a:effectLst>
-            <a:outerShdw blurRad="57150" dist="19050" dir="5400000" algn="ctr" rotWithShape="0">
+            <a:outerShdw blurRad="40000" dist="23000" dir="5400000" rotWithShape="0">
               <a:srgbClr val="000000">
-                <a:alpha val="63000"/>
+                <a:alpha val="35000"/>
               </a:srgbClr>
             </a:outerShdw>
           </a:effectLst>
+        </a:effectStyle>
+        <a:effectStyle>
+          <a:effectLst>
+            <a:outerShdw blurRad="40000" dist="23000" dir="5400000" rotWithShape="0">
+              <a:srgbClr val="000000">
+                <a:alpha val="35000"/>
+              </a:srgbClr>
+            </a:outerShdw>
+          </a:effectLst>
+          <a:scene3d>
+            <a:camera prst="orthographicFront">
+              <a:rot lat="0" lon="0" rev="0"/>
+            </a:camera>
+            <a:lightRig rig="threePt" dir="t">
+              <a:rot lat="0" lon="0" rev="1200000"/>
+            </a:lightRig>
+          </a:scene3d>
+          <a:sp3d>
+            <a:bevelT w="63500" h="25400"/>
+          </a:sp3d>
         </a:effectStyle>
       </a:effectStyleLst>
       <a:bgFillStyleLst>
         <a:solidFill>
           <a:schemeClr val="phClr"/>
         </a:solidFill>
-        <a:solidFill>
-          <a:schemeClr val="phClr">
-            <a:tint val="95000"/>
-            <a:satMod val="170000"/>
-          </a:schemeClr>
-        </a:solidFill>
         <a:gradFill rotWithShape="1">
           <a:gsLst>
             <a:gs pos="0">
               <a:schemeClr val="phClr">
-                <a:tint val="93000"/>
-                <a:satMod val="150000"/>
-                <a:shade val="98000"/>
-                <a:lumMod val="102000"/>
+                <a:tint val="40000"/>
+                <a:satMod val="350000"/>
               </a:schemeClr>
             </a:gs>
-            <a:gs pos="50000">
+            <a:gs pos="40000">
               <a:schemeClr val="phClr">
-                <a:tint val="98000"/>
-                <a:satMod val="130000"/>
-                <a:shade val="90000"/>
-                <a:lumMod val="103000"/>
+                <a:tint val="45000"/>
+                <a:shade val="99000"/>
+                <a:satMod val="350000"/>
               </a:schemeClr>
             </a:gs>
             <a:gs pos="100000">
               <a:schemeClr val="phClr">
-                <a:shade val="63000"/>
-                <a:satMod val="120000"/>
+                <a:shade val="20000"/>
+                <a:satMod val="255000"/>
               </a:schemeClr>
             </a:gs>
           </a:gsLst>
-          <a:lin ang="5400000" scaled="0"/>
+          <a:path path="circle">
+            <a:fillToRect l="50000" t="-80000" r="50000" b="180000"/>
+          </a:path>
+        </a:gradFill>
+        <a:gradFill rotWithShape="1">
+          <a:gsLst>
+            <a:gs pos="0">
+              <a:schemeClr val="phClr">
+                <a:tint val="80000"/>
+                <a:satMod val="300000"/>
+              </a:schemeClr>
+            </a:gs>
+            <a:gs pos="100000">
+              <a:schemeClr val="phClr">
+                <a:shade val="30000"/>
+                <a:satMod val="200000"/>
+              </a:schemeClr>
+            </a:gs>
+          </a:gsLst>
+          <a:path path="circle">
+            <a:fillToRect l="50000" t="50000" r="50000" b="50000"/>
+          </a:path>
         </a:gradFill>
       </a:bgFillStyleLst>
     </a:fmtScheme>
   </a:themeElements>
   <a:objectDefaults/>
   <a:extraClrSchemeLst/>
-  <a:extLst>
-    <a:ext uri="{05A4C25C-085E-4340-85A3-A5531E510DB2}">
-      <thm15:themeFamily xmlns:thm15="http://schemas.microsoft.com/office/thememl/2012/main" name="Office Theme" id="{62F939B6-93AF-4DB8-9C6B-D6C7DFDC589F}" vid="{4A3C46E8-61CC-4603-A589-7422A47A8E4A}"/>
-    </a:ext>
-  </a:extLst>
 </a:theme>
 </file>
 
@@ -4779,7 +5428,7 @@
 </file>
 
 <file path=customXml/itemProps1.xml><?xml version="1.0" encoding="utf-8"?>
-<ds:datastoreItem xmlns:ds="http://schemas.openxmlformats.org/officeDocument/2006/customXml" ds:itemID="{ED006859-CFE7-48E7-AC55-5E154A081104}">
+<ds:datastoreItem xmlns:ds="http://schemas.openxmlformats.org/officeDocument/2006/customXml" ds:itemID="{F9D4A2F2-5A76-44BA-8C46-E5F2254976F8}">
   <ds:schemaRefs>
     <ds:schemaRef ds:uri="http://schemas.openxmlformats.org/officeDocument/2006/bibliography"/>
   </ds:schemaRefs>

</xml_diff>